<commit_message>
update resume and descriptions
</commit_message>
<xml_diff>
--- a/Colby_Sullivan_Resume.docx
+++ b/Colby_Sullivan_Resume.docx
@@ -75,8 +75,18 @@
           <w:sz w:val="20"/>
           <w:szCs w:val="20"/>
         </w:rPr>
-        <w:t>linkedin.com/in/colbywsullivan</w:t>
-      </w:r>
+        <w:t>linkedin.com/in/</w:t>
+      </w:r>
+      <w:proofErr w:type="spellStart"/>
+      <w:r>
+        <w:rPr>
+          <w:rFonts w:ascii="Arial Narrow" w:hAnsi="Arial Narrow"/>
+          <w:sz w:val="20"/>
+          <w:szCs w:val="20"/>
+        </w:rPr>
+        <w:t>colbywsullivan</w:t>
+      </w:r>
+      <w:proofErr w:type="spellEnd"/>
       <w:r>
         <w:rPr>
           <w:rFonts w:ascii="Arial Narrow" w:hAnsi="Arial Narrow"/>
@@ -91,8 +101,18 @@
           <w:sz w:val="20"/>
           <w:szCs w:val="20"/>
         </w:rPr>
-        <w:t>github.com/colbysullivan</w:t>
-      </w:r>
+        <w:t>github.com/</w:t>
+      </w:r>
+      <w:proofErr w:type="spellStart"/>
+      <w:r>
+        <w:rPr>
+          <w:rFonts w:ascii="Arial Narrow" w:hAnsi="Arial Narrow"/>
+          <w:sz w:val="20"/>
+          <w:szCs w:val="20"/>
+        </w:rPr>
+        <w:t>colbysullivan</w:t>
+      </w:r>
+      <w:proofErr w:type="spellEnd"/>
       <w:r>
         <w:rPr>
           <w:rFonts w:ascii="Arial Narrow" w:hAnsi="Arial Narrow"/>
@@ -1011,7 +1031,25 @@
           <w:sz w:val="20"/>
           <w:szCs w:val="20"/>
         </w:rPr>
-        <w:t xml:space="preserve"> onsite with system admins to setup and maintain existing network infrastructure</w:t>
+        <w:t xml:space="preserve"> onsite with system admins to </w:t>
+      </w:r>
+      <w:proofErr w:type="gramStart"/>
+      <w:r>
+        <w:rPr>
+          <w:rFonts w:ascii="Arial Narrow" w:hAnsi="Arial Narrow"/>
+          <w:sz w:val="20"/>
+          <w:szCs w:val="20"/>
+        </w:rPr>
+        <w:t>setup</w:t>
+      </w:r>
+      <w:proofErr w:type="gramEnd"/>
+      <w:r>
+        <w:rPr>
+          <w:rFonts w:ascii="Arial Narrow" w:hAnsi="Arial Narrow"/>
+          <w:sz w:val="20"/>
+          <w:szCs w:val="20"/>
+        </w:rPr>
+        <w:t xml:space="preserve"> and maintain existing network infrastructure</w:t>
       </w:r>
     </w:p>
     <w:p>
@@ -1177,6 +1215,7 @@
           <w:szCs w:val="20"/>
         </w:rPr>
       </w:pPr>
+      <w:proofErr w:type="spellStart"/>
       <w:r>
         <w:rPr>
           <w:rFonts w:ascii="Arial Narrow" w:hAnsi="Arial Narrow"/>
@@ -1185,6 +1224,7 @@
         </w:rPr>
         <w:t>Apptronik</w:t>
       </w:r>
+      <w:proofErr w:type="spellEnd"/>
       <w:r>
         <w:rPr>
           <w:rFonts w:ascii="Arial Narrow" w:hAnsi="Arial Narrow"/>
@@ -1192,13 +1232,6 @@
           <w:szCs w:val="20"/>
         </w:rPr>
         <w:tab/>
-      </w:r>
-      <w:r>
-        <w:rPr>
-          <w:rFonts w:ascii="Arial Narrow" w:hAnsi="Arial Narrow"/>
-          <w:sz w:val="20"/>
-          <w:szCs w:val="20"/>
-        </w:rPr>
         <w:t>Austin</w:t>
       </w:r>
       <w:r>
@@ -1233,7 +1266,7 @@
           <w:sz w:val="20"/>
           <w:szCs w:val="20"/>
         </w:rPr>
-        <w:t>Served as primary IT support specialist on a 3-person team in a humanoid robotics company, providing day-to-day technical support and helping maintain reliable operations across users and systems.</w:t>
+        <w:t>Served as IT support specialist on a 3-person team in a humanoid robotics company, providing day-to-day technical support and helping maintain reliable operations across users and systems.</w:t>
       </w:r>
     </w:p>
     <w:p>
@@ -1317,7 +1350,25 @@
           <w:sz w:val="20"/>
           <w:szCs w:val="20"/>
         </w:rPr>
-        <w:t>Supported overseas operations as a key IT point of contact, helping coordinate technical assistance across time zones and ensuring issues were addressed efficiently for international teams.</w:t>
+        <w:t xml:space="preserve">Supported overseas operations as a key IT point of contact, helping coordinate technical assistance across time zones and ensuring issues </w:t>
+      </w:r>
+      <w:proofErr w:type="gramStart"/>
+      <w:r>
+        <w:rPr>
+          <w:rFonts w:ascii="Arial Narrow" w:hAnsi="Arial Narrow"/>
+          <w:sz w:val="20"/>
+          <w:szCs w:val="20"/>
+        </w:rPr>
+        <w:t>were</w:t>
+      </w:r>
+      <w:proofErr w:type="gramEnd"/>
+      <w:r>
+        <w:rPr>
+          <w:rFonts w:ascii="Arial Narrow" w:hAnsi="Arial Narrow"/>
+          <w:sz w:val="20"/>
+          <w:szCs w:val="20"/>
+        </w:rPr>
+        <w:t xml:space="preserve"> addressed efficiently for international teams.</w:t>
       </w:r>
     </w:p>
     <w:p>
@@ -1517,8 +1568,9 @@
           <w:lang w:bidi="ar-SA"/>
           <w14:ligatures w14:val="none"/>
         </w:rPr>
-        <w:t>effectively manag</w:t>
-      </w:r>
+        <w:t xml:space="preserve">effectively </w:t>
+      </w:r>
+      <w:proofErr w:type="gramStart"/>
       <w:r>
         <w:rPr>
           <w:rFonts w:ascii="Arial Narrow" w:eastAsia="Times New Roman" w:hAnsi="Arial Narrow" w:cs="Times New Roman"/>
@@ -1529,8 +1581,21 @@
           <w:lang w:bidi="ar-SA"/>
           <w14:ligatures w14:val="none"/>
         </w:rPr>
+        <w:t>manag</w:t>
+      </w:r>
+      <w:r>
+        <w:rPr>
+          <w:rFonts w:ascii="Arial Narrow" w:eastAsia="Times New Roman" w:hAnsi="Arial Narrow" w:cs="Times New Roman"/>
+          <w:color w:val="auto"/>
+          <w:kern w:val="0"/>
+          <w:sz w:val="20"/>
+          <w:szCs w:val="20"/>
+          <w:lang w:bidi="ar-SA"/>
+          <w14:ligatures w14:val="none"/>
+        </w:rPr>
         <w:t>es</w:t>
       </w:r>
+      <w:proofErr w:type="gramEnd"/>
       <w:r>
         <w:rPr>
           <w:rFonts w:ascii="Arial Narrow" w:eastAsia="Times New Roman" w:hAnsi="Arial Narrow" w:cs="Times New Roman"/>
@@ -1571,7 +1636,33 @@
           <w:lang w:bidi="ar-SA"/>
           <w14:ligatures w14:val="none"/>
         </w:rPr>
-        <w:t>Received positive feedback from department chairs for the application's ease of use and efficiency in scheduling</w:t>
+        <w:t xml:space="preserve">Received positive feedback from department chairs </w:t>
+      </w:r>
+      <w:proofErr w:type="gramStart"/>
+      <w:r>
+        <w:rPr>
+          <w:rFonts w:ascii="Arial Narrow" w:eastAsia="Times New Roman" w:hAnsi="Arial Narrow" w:cs="Times New Roman"/>
+          <w:color w:val="auto"/>
+          <w:kern w:val="0"/>
+          <w:sz w:val="20"/>
+          <w:szCs w:val="20"/>
+          <w:lang w:bidi="ar-SA"/>
+          <w14:ligatures w14:val="none"/>
+        </w:rPr>
+        <w:t>for</w:t>
+      </w:r>
+      <w:proofErr w:type="gramEnd"/>
+      <w:r>
+        <w:rPr>
+          <w:rFonts w:ascii="Arial Narrow" w:eastAsia="Times New Roman" w:hAnsi="Arial Narrow" w:cs="Times New Roman"/>
+          <w:color w:val="auto"/>
+          <w:kern w:val="0"/>
+          <w:sz w:val="20"/>
+          <w:szCs w:val="20"/>
+          <w:lang w:bidi="ar-SA"/>
+          <w14:ligatures w14:val="none"/>
+        </w:rPr>
+        <w:t xml:space="preserve"> the application's ease of use and efficiency in scheduling</w:t>
       </w:r>
     </w:p>
     <w:p>
@@ -1627,8 +1718,48 @@
           <w:lang w:bidi="ar-SA"/>
           <w14:ligatures w14:val="none"/>
         </w:rPr>
-        <w:t>Created command line scripts using Python that extracted client security data from varies web services such as Celerium and SentinelOne</w:t>
-      </w:r>
+        <w:t xml:space="preserve">Created command line scripts using Python that extracted client security data from varies web services such as </w:t>
+      </w:r>
+      <w:proofErr w:type="spellStart"/>
+      <w:r>
+        <w:rPr>
+          <w:rFonts w:ascii="Arial Narrow" w:eastAsia="Times New Roman" w:hAnsi="Arial Narrow" w:cs="Times New Roman"/>
+          <w:color w:val="auto"/>
+          <w:kern w:val="0"/>
+          <w:sz w:val="20"/>
+          <w:szCs w:val="20"/>
+          <w:lang w:bidi="ar-SA"/>
+          <w14:ligatures w14:val="none"/>
+        </w:rPr>
+        <w:t>Celerium</w:t>
+      </w:r>
+      <w:proofErr w:type="spellEnd"/>
+      <w:r>
+        <w:rPr>
+          <w:rFonts w:ascii="Arial Narrow" w:eastAsia="Times New Roman" w:hAnsi="Arial Narrow" w:cs="Times New Roman"/>
+          <w:color w:val="auto"/>
+          <w:kern w:val="0"/>
+          <w:sz w:val="20"/>
+          <w:szCs w:val="20"/>
+          <w:lang w:bidi="ar-SA"/>
+          <w14:ligatures w14:val="none"/>
+        </w:rPr>
+        <w:t xml:space="preserve"> and </w:t>
+      </w:r>
+      <w:proofErr w:type="spellStart"/>
+      <w:r>
+        <w:rPr>
+          <w:rFonts w:ascii="Arial Narrow" w:eastAsia="Times New Roman" w:hAnsi="Arial Narrow" w:cs="Times New Roman"/>
+          <w:color w:val="auto"/>
+          <w:kern w:val="0"/>
+          <w:sz w:val="20"/>
+          <w:szCs w:val="20"/>
+          <w:lang w:bidi="ar-SA"/>
+          <w14:ligatures w14:val="none"/>
+        </w:rPr>
+        <w:t>SentinelOne</w:t>
+      </w:r>
+      <w:proofErr w:type="spellEnd"/>
     </w:p>
     <w:p>
       <w:pPr>
@@ -1840,13 +1971,41 @@
         </w:rPr>
         <w:t xml:space="preserve">Perforce, </w:t>
       </w:r>
-      <w:r>
-        <w:rPr>
-          <w:rFonts w:ascii="Arial Narrow" w:hAnsi="Arial Narrow"/>
-          <w:sz w:val="20"/>
-          <w:szCs w:val="20"/>
-        </w:rPr>
-        <w:t>GitKraken, VS Code, Visual Studio, Intellij, Eclipse, Microsoft Azure</w:t>
+      <w:proofErr w:type="spellStart"/>
+      <w:r>
+        <w:rPr>
+          <w:rFonts w:ascii="Arial Narrow" w:hAnsi="Arial Narrow"/>
+          <w:sz w:val="20"/>
+          <w:szCs w:val="20"/>
+        </w:rPr>
+        <w:t>GitKraken</w:t>
+      </w:r>
+      <w:proofErr w:type="spellEnd"/>
+      <w:r>
+        <w:rPr>
+          <w:rFonts w:ascii="Arial Narrow" w:hAnsi="Arial Narrow"/>
+          <w:sz w:val="20"/>
+          <w:szCs w:val="20"/>
+        </w:rPr>
+        <w:t xml:space="preserve">, VS Code, Visual Studio, </w:t>
+      </w:r>
+      <w:proofErr w:type="spellStart"/>
+      <w:r>
+        <w:rPr>
+          <w:rFonts w:ascii="Arial Narrow" w:hAnsi="Arial Narrow"/>
+          <w:sz w:val="20"/>
+          <w:szCs w:val="20"/>
+        </w:rPr>
+        <w:t>Intellij</w:t>
+      </w:r>
+      <w:proofErr w:type="spellEnd"/>
+      <w:r>
+        <w:rPr>
+          <w:rFonts w:ascii="Arial Narrow" w:hAnsi="Arial Narrow"/>
+          <w:sz w:val="20"/>
+          <w:szCs w:val="20"/>
+        </w:rPr>
+        <w:t>, Eclipse, Microsoft Azure</w:t>
       </w:r>
       <w:r>
         <w:rPr>
@@ -1894,7 +2053,25 @@
           <w:sz w:val="20"/>
           <w:szCs w:val="20"/>
         </w:rPr>
-        <w:t>: pandas, Raylib, NumPy, Matplotlib, SFML, OpenGL</w:t>
+        <w:t xml:space="preserve">: pandas, </w:t>
+      </w:r>
+      <w:proofErr w:type="spellStart"/>
+      <w:r>
+        <w:rPr>
+          <w:rFonts w:ascii="Arial Narrow" w:hAnsi="Arial Narrow"/>
+          <w:sz w:val="20"/>
+          <w:szCs w:val="20"/>
+        </w:rPr>
+        <w:t>Raylib</w:t>
+      </w:r>
+      <w:proofErr w:type="spellEnd"/>
+      <w:r>
+        <w:rPr>
+          <w:rFonts w:ascii="Arial Narrow" w:hAnsi="Arial Narrow"/>
+          <w:sz w:val="20"/>
+          <w:szCs w:val="20"/>
+        </w:rPr>
+        <w:t>, NumPy, Matplotlib, SFML, OpenGL</w:t>
       </w:r>
       <w:r>
         <w:rPr>
@@ -4649,6 +4826,7 @@
   <w:style w:type="character" w:default="1" w:styleId="DefaultParagraphFont">
     <w:name w:val="Default Paragraph Font"/>
     <w:uiPriority w:val="1"/>
+    <w:semiHidden/>
     <w:unhideWhenUsed/>
   </w:style>
   <w:style w:type="table" w:default="1" w:styleId="TableNormal">

</xml_diff>

<commit_message>
Add colorblind theme, project content, and accessibility polish
Accessibility
- Add a colorblind-friendly theme toggle in the header (high-contrast
  Okabe-Ito palette, no-flash load, saved to localStorage)
- Fix low-contrast green-on-green text (darker panels, lighter mint headings)
- Add a working SVG favicon and Open Graph / Twitter share-preview meta

Content & media
- Rename the "TGP II" project to "Hamster Ballin'" and embed its trailer
  (replacing the placeholder Rickroll video)
- Convert the resume to an inline-viewable PDF and update to the latest version
- Add tech/tools tags to each project (Unity, Unreal, Godot, custom C++
  engine, GDScript, Perforce)
- Fill in DFS I copy and the Resume / Cover Letter card descriptions

Layout
- Align portfolio card descriptions and buttons across all cards
- Match the LinkedIn button shading to GitHub
</commit_message>
<xml_diff>
--- a/Colby_Sullivan_Resume.docx
+++ b/Colby_Sullivan_Resume.docx
@@ -127,7 +127,7 @@
           <w:sz w:val="20"/>
           <w:szCs w:val="20"/>
         </w:rPr>
-        <w:t>https://colbysullivan.github.io</w:t>
+        <w:t>www.colbysullivan.com</w:t>
       </w:r>
     </w:p>
     <w:p>
@@ -151,7 +151,7 @@
         <w:tabs>
           <w:tab w:val="right" w:pos="10800"/>
         </w:tabs>
-        <w:spacing w:after="0" w:line="240" w:lineRule="auto"/>
+        <w:spacing w:after="0" w:line="360" w:lineRule="auto"/>
         <w:ind w:left="0" w:firstLine="0"/>
         <w:rPr>
           <w:rFonts w:ascii="Arial Narrow" w:hAnsi="Arial Narrow"/>
@@ -171,20 +171,6 @@
         </w:rPr>
         <w:t>EDUCATION</w:t>
       </w:r>
-    </w:p>
-    <w:p>
-      <w:pPr>
-        <w:tabs>
-          <w:tab w:val="right" w:pos="10800"/>
-        </w:tabs>
-        <w:spacing w:after="0" w:line="240" w:lineRule="auto"/>
-        <w:ind w:left="0" w:firstLine="0"/>
-        <w:rPr>
-          <w:rFonts w:ascii="Arial Narrow" w:hAnsi="Arial Narrow"/>
-          <w:sz w:val="20"/>
-          <w:szCs w:val="20"/>
-        </w:rPr>
-      </w:pPr>
     </w:p>
     <w:p>
       <w:pPr>
@@ -299,6 +285,126 @@
         <w:ind w:left="0" w:firstLine="0"/>
         <w:rPr>
           <w:rFonts w:ascii="Arial Narrow" w:hAnsi="Arial Narrow"/>
+          <w:b/>
+          <w:bCs/>
+          <w:sz w:val="20"/>
+          <w:szCs w:val="20"/>
+        </w:rPr>
+      </w:pPr>
+    </w:p>
+    <w:p>
+      <w:pPr>
+        <w:tabs>
+          <w:tab w:val="right" w:pos="10800"/>
+        </w:tabs>
+        <w:spacing w:after="0" w:line="240" w:lineRule="auto"/>
+        <w:ind w:left="0" w:firstLine="0"/>
+        <w:rPr>
+          <w:rFonts w:ascii="Arial Narrow" w:hAnsi="Arial Narrow"/>
+          <w:sz w:val="20"/>
+          <w:szCs w:val="20"/>
+        </w:rPr>
+      </w:pPr>
+      <w:proofErr w:type="gramStart"/>
+      <w:r>
+        <w:rPr>
+          <w:rFonts w:ascii="Arial Narrow" w:hAnsi="Arial Narrow"/>
+          <w:b/>
+          <w:bCs/>
+          <w:sz w:val="20"/>
+          <w:szCs w:val="20"/>
+        </w:rPr>
+        <w:t>Masters in Interactive Technology</w:t>
+      </w:r>
+      <w:proofErr w:type="gramEnd"/>
+      <w:r>
+        <w:rPr>
+          <w:rFonts w:ascii="Arial Narrow" w:hAnsi="Arial Narrow"/>
+          <w:sz w:val="20"/>
+          <w:szCs w:val="20"/>
+        </w:rPr>
+        <w:tab/>
+      </w:r>
+      <w:r>
+        <w:rPr>
+          <w:rFonts w:ascii="Arial Narrow" w:hAnsi="Arial Narrow"/>
+          <w:sz w:val="20"/>
+          <w:szCs w:val="20"/>
+        </w:rPr>
+        <w:t xml:space="preserve">August </w:t>
+      </w:r>
+      <w:r>
+        <w:rPr>
+          <w:rFonts w:ascii="Arial Narrow" w:hAnsi="Arial Narrow"/>
+          <w:sz w:val="20"/>
+          <w:szCs w:val="20"/>
+        </w:rPr>
+        <w:t>202</w:t>
+      </w:r>
+      <w:r>
+        <w:rPr>
+          <w:rFonts w:ascii="Arial Narrow" w:hAnsi="Arial Narrow"/>
+          <w:sz w:val="20"/>
+          <w:szCs w:val="20"/>
+        </w:rPr>
+        <w:t>5 - Present</w:t>
+      </w:r>
+    </w:p>
+    <w:p>
+      <w:pPr>
+        <w:tabs>
+          <w:tab w:val="right" w:pos="10800"/>
+        </w:tabs>
+        <w:spacing w:after="0" w:line="240" w:lineRule="auto"/>
+        <w:ind w:left="0" w:firstLine="0"/>
+        <w:rPr>
+          <w:rFonts w:ascii="Arial Narrow" w:hAnsi="Arial Narrow"/>
+          <w:sz w:val="20"/>
+          <w:szCs w:val="20"/>
+        </w:rPr>
+      </w:pPr>
+      <w:r>
+        <w:rPr>
+          <w:rFonts w:ascii="Arial Narrow" w:hAnsi="Arial Narrow"/>
+          <w:sz w:val="20"/>
+          <w:szCs w:val="20"/>
+        </w:rPr>
+        <w:t>Southern Methodist University</w:t>
+      </w:r>
+      <w:r>
+        <w:rPr>
+          <w:rFonts w:ascii="Arial Narrow" w:hAnsi="Arial Narrow"/>
+          <w:sz w:val="20"/>
+          <w:szCs w:val="20"/>
+        </w:rPr>
+        <w:tab/>
+      </w:r>
+      <w:r>
+        <w:rPr>
+          <w:rFonts w:ascii="Arial Narrow" w:hAnsi="Arial Narrow"/>
+          <w:sz w:val="20"/>
+          <w:szCs w:val="20"/>
+        </w:rPr>
+        <w:t>Dallas</w:t>
+      </w:r>
+      <w:r>
+        <w:rPr>
+          <w:rFonts w:ascii="Arial Narrow" w:hAnsi="Arial Narrow"/>
+          <w:sz w:val="20"/>
+          <w:szCs w:val="20"/>
+        </w:rPr>
+        <w:t>, TX</w:t>
+      </w:r>
+    </w:p>
+    <w:p>
+      <w:pPr>
+        <w:tabs>
+          <w:tab w:val="right" w:pos="10800"/>
+        </w:tabs>
+        <w:spacing w:after="0" w:line="240" w:lineRule="auto"/>
+        <w:ind w:left="0" w:firstLine="0"/>
+        <w:rPr>
+          <w:rFonts w:ascii="Arial Narrow" w:hAnsi="Arial Narrow"/>
           <w:sz w:val="20"/>
           <w:szCs w:val="20"/>
         </w:rPr>
@@ -318,16 +424,60 @@
         <w:tabs>
           <w:tab w:val="right" w:pos="10800"/>
         </w:tabs>
+        <w:spacing w:after="0" w:line="360" w:lineRule="auto"/>
+        <w:ind w:left="0" w:firstLine="0"/>
+        <w:rPr>
+          <w:rFonts w:ascii="Arial Narrow" w:hAnsi="Arial Narrow"/>
+          <w:b/>
+          <w:bCs/>
+          <w:sz w:val="20"/>
+          <w:szCs w:val="20"/>
+        </w:rPr>
+      </w:pPr>
+      <w:r>
+        <w:rPr>
+          <w:rFonts w:ascii="Arial Narrow" w:hAnsi="Arial Narrow"/>
+          <w:b/>
+          <w:bCs/>
+          <w:sz w:val="20"/>
+          <w:szCs w:val="20"/>
+        </w:rPr>
+        <w:t xml:space="preserve">TECHNOLOGY </w:t>
+      </w:r>
+      <w:r>
+        <w:rPr>
+          <w:rFonts w:ascii="Arial Narrow" w:hAnsi="Arial Narrow"/>
+          <w:b/>
+          <w:bCs/>
+          <w:sz w:val="20"/>
+          <w:szCs w:val="20"/>
+        </w:rPr>
+        <w:t>EXPERIENCE</w:t>
+      </w:r>
+    </w:p>
+    <w:p>
+      <w:pPr>
+        <w:tabs>
+          <w:tab w:val="right" w:pos="10800"/>
+        </w:tabs>
         <w:spacing w:after="0" w:line="240" w:lineRule="auto"/>
         <w:ind w:left="0" w:firstLine="0"/>
         <w:rPr>
           <w:rFonts w:ascii="Arial Narrow" w:hAnsi="Arial Narrow"/>
+          <w:sz w:val="20"/>
+          <w:szCs w:val="20"/>
+        </w:rPr>
+      </w:pPr>
+      <w:r>
+        <w:rPr>
+          <w:rFonts w:ascii="Arial Narrow" w:hAnsi="Arial Narrow"/>
           <w:b/>
           <w:bCs/>
           <w:sz w:val="20"/>
           <w:szCs w:val="20"/>
         </w:rPr>
-      </w:pPr>
+        <w:t xml:space="preserve">Information Technology </w:t>
+      </w:r>
       <w:r>
         <w:rPr>
           <w:rFonts w:ascii="Arial Narrow" w:hAnsi="Arial Narrow"/>
@@ -336,8 +486,230 @@
           <w:sz w:val="20"/>
           <w:szCs w:val="20"/>
         </w:rPr>
-        <w:t xml:space="preserve">TECHNOLOGY </w:t>
-      </w:r>
+        <w:t>Support Specialist</w:t>
+      </w:r>
+      <w:r>
+        <w:rPr>
+          <w:rFonts w:ascii="Arial Narrow" w:hAnsi="Arial Narrow"/>
+          <w:sz w:val="20"/>
+          <w:szCs w:val="20"/>
+        </w:rPr>
+        <w:tab/>
+        <w:t>Jul</w:t>
+      </w:r>
+      <w:r>
+        <w:rPr>
+          <w:rFonts w:ascii="Arial Narrow" w:hAnsi="Arial Narrow"/>
+          <w:sz w:val="20"/>
+          <w:szCs w:val="20"/>
+        </w:rPr>
+        <w:t xml:space="preserve"> 202</w:t>
+      </w:r>
+      <w:r>
+        <w:rPr>
+          <w:rFonts w:ascii="Arial Narrow" w:hAnsi="Arial Narrow"/>
+          <w:sz w:val="20"/>
+          <w:szCs w:val="20"/>
+        </w:rPr>
+        <w:t>4</w:t>
+      </w:r>
+      <w:r>
+        <w:rPr>
+          <w:rFonts w:ascii="Arial Narrow" w:hAnsi="Arial Narrow"/>
+          <w:sz w:val="20"/>
+          <w:szCs w:val="20"/>
+        </w:rPr>
+        <w:t xml:space="preserve"> – Aug</w:t>
+      </w:r>
+      <w:r>
+        <w:rPr>
+          <w:rFonts w:ascii="Arial Narrow" w:hAnsi="Arial Narrow"/>
+          <w:sz w:val="20"/>
+          <w:szCs w:val="20"/>
+        </w:rPr>
+        <w:t>ust</w:t>
+      </w:r>
+      <w:r>
+        <w:rPr>
+          <w:rFonts w:ascii="Arial Narrow" w:hAnsi="Arial Narrow"/>
+          <w:sz w:val="20"/>
+          <w:szCs w:val="20"/>
+        </w:rPr>
+        <w:t xml:space="preserve"> 202</w:t>
+      </w:r>
+      <w:r>
+        <w:rPr>
+          <w:rFonts w:ascii="Arial Narrow" w:hAnsi="Arial Narrow"/>
+          <w:sz w:val="20"/>
+          <w:szCs w:val="20"/>
+        </w:rPr>
+        <w:t>5</w:t>
+      </w:r>
+    </w:p>
+    <w:p>
+      <w:pPr>
+        <w:tabs>
+          <w:tab w:val="right" w:pos="10800"/>
+        </w:tabs>
+        <w:spacing w:after="0" w:line="240" w:lineRule="auto"/>
+        <w:ind w:left="0" w:firstLine="0"/>
+        <w:rPr>
+          <w:rFonts w:ascii="Arial Narrow" w:hAnsi="Arial Narrow"/>
+          <w:sz w:val="20"/>
+          <w:szCs w:val="20"/>
+        </w:rPr>
+      </w:pPr>
+      <w:proofErr w:type="spellStart"/>
+      <w:r>
+        <w:rPr>
+          <w:rFonts w:ascii="Arial Narrow" w:hAnsi="Arial Narrow"/>
+          <w:sz w:val="20"/>
+          <w:szCs w:val="20"/>
+        </w:rPr>
+        <w:t>Apptronik</w:t>
+      </w:r>
+      <w:proofErr w:type="spellEnd"/>
+      <w:r>
+        <w:rPr>
+          <w:rFonts w:ascii="Arial Narrow" w:hAnsi="Arial Narrow"/>
+          <w:sz w:val="20"/>
+          <w:szCs w:val="20"/>
+        </w:rPr>
+        <w:tab/>
+        <w:t>Austin</w:t>
+      </w:r>
+      <w:r>
+        <w:rPr>
+          <w:rFonts w:ascii="Arial Narrow" w:hAnsi="Arial Narrow"/>
+          <w:sz w:val="20"/>
+          <w:szCs w:val="20"/>
+        </w:rPr>
+        <w:t xml:space="preserve">, TX </w:t>
+      </w:r>
+    </w:p>
+    <w:p>
+      <w:pPr>
+        <w:pStyle w:val="ListParagraph"/>
+        <w:numPr>
+          <w:ilvl w:val="0"/>
+          <w:numId w:val="9"/>
+        </w:numPr>
+        <w:tabs>
+          <w:tab w:val="right" w:pos="10800"/>
+        </w:tabs>
+        <w:spacing w:after="0" w:line="240" w:lineRule="auto"/>
+        <w:rPr>
+          <w:rFonts w:ascii="Arial Narrow" w:hAnsi="Arial Narrow"/>
+          <w:sz w:val="20"/>
+          <w:szCs w:val="20"/>
+        </w:rPr>
+      </w:pPr>
+      <w:r>
+        <w:rPr>
+          <w:rFonts w:ascii="Arial Narrow" w:hAnsi="Arial Narrow"/>
+          <w:sz w:val="20"/>
+          <w:szCs w:val="20"/>
+        </w:rPr>
+        <w:t>Served as IT support specialist on a 3-person team in a humanoid robotics company, providing day-to-day technical support and helping maintain reliable operations across users and systems.</w:t>
+      </w:r>
+    </w:p>
+    <w:p>
+      <w:pPr>
+        <w:pStyle w:val="ListParagraph"/>
+        <w:numPr>
+          <w:ilvl w:val="0"/>
+          <w:numId w:val="9"/>
+        </w:numPr>
+        <w:tabs>
+          <w:tab w:val="right" w:pos="10800"/>
+        </w:tabs>
+        <w:spacing w:after="0" w:line="240" w:lineRule="auto"/>
+        <w:rPr>
+          <w:rFonts w:ascii="Arial Narrow" w:hAnsi="Arial Narrow"/>
+          <w:sz w:val="20"/>
+          <w:szCs w:val="20"/>
+        </w:rPr>
+      </w:pPr>
+      <w:r>
+        <w:rPr>
+          <w:rFonts w:ascii="Arial Narrow" w:hAnsi="Arial Narrow"/>
+          <w:sz w:val="20"/>
+          <w:szCs w:val="20"/>
+        </w:rPr>
+        <w:t>Acted as the sole Linux support resource, troubleshooting, maintaining, and supporting Linux-based systems critical to engineering and development workflows.</w:t>
+      </w:r>
+      <w:r>
+        <w:t xml:space="preserve"> </w:t>
+      </w:r>
+    </w:p>
+    <w:p>
+      <w:pPr>
+        <w:pStyle w:val="ListParagraph"/>
+        <w:numPr>
+          <w:ilvl w:val="0"/>
+          <w:numId w:val="9"/>
+        </w:numPr>
+        <w:tabs>
+          <w:tab w:val="right" w:pos="10800"/>
+        </w:tabs>
+        <w:spacing w:after="0" w:line="240" w:lineRule="auto"/>
+        <w:rPr>
+          <w:rFonts w:ascii="Arial Narrow" w:hAnsi="Arial Narrow"/>
+          <w:sz w:val="20"/>
+          <w:szCs w:val="20"/>
+        </w:rPr>
+      </w:pPr>
+      <w:r>
+        <w:rPr>
+          <w:rFonts w:ascii="Arial Narrow" w:hAnsi="Arial Narrow"/>
+          <w:sz w:val="20"/>
+          <w:szCs w:val="20"/>
+        </w:rPr>
+        <w:t>Developed and documented provisioning processes for custom embedded machines, improving consistency, setup efficiency, and supportability for specialized robotics hardware.</w:t>
+      </w:r>
+      <w:r>
+        <w:t xml:space="preserve"> </w:t>
+      </w:r>
+    </w:p>
+    <w:p>
+      <w:pPr>
+        <w:pStyle w:val="ListParagraph"/>
+        <w:numPr>
+          <w:ilvl w:val="0"/>
+          <w:numId w:val="9"/>
+        </w:numPr>
+        <w:tabs>
+          <w:tab w:val="right" w:pos="10800"/>
+        </w:tabs>
+        <w:spacing w:after="0" w:line="240" w:lineRule="auto"/>
+        <w:rPr>
+          <w:rFonts w:ascii="Arial Narrow" w:hAnsi="Arial Narrow"/>
+          <w:sz w:val="20"/>
+          <w:szCs w:val="20"/>
+        </w:rPr>
+      </w:pPr>
+      <w:r>
+        <w:rPr>
+          <w:rFonts w:ascii="Arial Narrow" w:hAnsi="Arial Narrow"/>
+          <w:sz w:val="20"/>
+          <w:szCs w:val="20"/>
+        </w:rPr>
+        <w:t>Supported overseas operations as a key IT point of contact, helping coordinate technical assistance across time zones and ensuring issues were addressed efficiently for international teams.</w:t>
+      </w:r>
+    </w:p>
+    <w:p>
+      <w:pPr>
+        <w:tabs>
+          <w:tab w:val="right" w:pos="10800"/>
+        </w:tabs>
+        <w:spacing w:after="0" w:line="240" w:lineRule="auto"/>
+        <w:ind w:left="0" w:firstLine="0"/>
+        <w:rPr>
+          <w:rFonts w:ascii="Arial Narrow" w:hAnsi="Arial Narrow"/>
+          <w:sz w:val="20"/>
+          <w:szCs w:val="20"/>
+        </w:rPr>
+      </w:pPr>
       <w:r>
         <w:rPr>
           <w:rFonts w:ascii="Arial Narrow" w:hAnsi="Arial Narrow"/>
@@ -346,44 +718,6 @@
           <w:sz w:val="20"/>
           <w:szCs w:val="20"/>
         </w:rPr>
-        <w:t>EXPERIENCE</w:t>
-      </w:r>
-    </w:p>
-    <w:p>
-      <w:pPr>
-        <w:tabs>
-          <w:tab w:val="right" w:pos="10800"/>
-        </w:tabs>
-        <w:spacing w:after="0" w:line="240" w:lineRule="auto"/>
-        <w:ind w:left="0" w:firstLine="0"/>
-        <w:rPr>
-          <w:rFonts w:ascii="Arial Narrow" w:hAnsi="Arial Narrow"/>
-          <w:sz w:val="20"/>
-          <w:szCs w:val="20"/>
-        </w:rPr>
-      </w:pPr>
-    </w:p>
-    <w:p>
-      <w:pPr>
-        <w:tabs>
-          <w:tab w:val="right" w:pos="10800"/>
-        </w:tabs>
-        <w:spacing w:after="0" w:line="240" w:lineRule="auto"/>
-        <w:ind w:left="0" w:firstLine="0"/>
-        <w:rPr>
-          <w:rFonts w:ascii="Arial Narrow" w:hAnsi="Arial Narrow"/>
-          <w:sz w:val="20"/>
-          <w:szCs w:val="20"/>
-        </w:rPr>
-      </w:pPr>
-      <w:r>
-        <w:rPr>
-          <w:rFonts w:ascii="Arial Narrow" w:hAnsi="Arial Narrow"/>
-          <w:b/>
-          <w:bCs/>
-          <w:sz w:val="20"/>
-          <w:szCs w:val="20"/>
-        </w:rPr>
         <w:t>Information Technology Support Specialist</w:t>
       </w:r>
       <w:r>
@@ -440,15 +774,7 @@
           <w:sz w:val="20"/>
           <w:szCs w:val="20"/>
         </w:rPr>
-        <w:t>C</w:t>
-      </w:r>
-      <w:r>
-        <w:rPr>
-          <w:rFonts w:ascii="Arial Narrow" w:hAnsi="Arial Narrow"/>
-          <w:sz w:val="20"/>
-          <w:szCs w:val="20"/>
-        </w:rPr>
-        <w:t>urrent</w:t>
+        <w:t>2024</w:t>
       </w:r>
     </w:p>
     <w:p>
@@ -593,18 +919,26 @@
     </w:p>
     <w:p>
       <w:pPr>
+        <w:pStyle w:val="ListParagraph"/>
         <w:tabs>
           <w:tab w:val="right" w:pos="10800"/>
         </w:tabs>
         <w:spacing w:after="0" w:line="240" w:lineRule="auto"/>
+        <w:ind w:firstLine="0"/>
+        <w:rPr>
+          <w:rFonts w:ascii="Arial Narrow" w:hAnsi="Arial Narrow"/>
+          <w:sz w:val="20"/>
+          <w:szCs w:val="20"/>
+        </w:rPr>
+      </w:pPr>
+    </w:p>
+    <w:p>
+      <w:pPr>
+        <w:tabs>
+          <w:tab w:val="right" w:pos="10800"/>
+        </w:tabs>
+        <w:spacing w:after="0" w:line="360" w:lineRule="auto"/>
         <w:ind w:left="0" w:firstLine="0"/>
-        <w:rPr>
-          <w:rFonts w:ascii="Arial Narrow" w:hAnsi="Arial Narrow"/>
-          <w:sz w:val="20"/>
-          <w:szCs w:val="20"/>
-        </w:rPr>
-      </w:pPr>
-      <w:r>
         <w:rPr>
           <w:rFonts w:ascii="Arial Narrow" w:hAnsi="Arial Narrow"/>
           <w:b/>
@@ -612,79 +946,16 @@
           <w:sz w:val="20"/>
           <w:szCs w:val="20"/>
         </w:rPr>
-        <w:t>Junior Security Analyst</w:t>
-      </w:r>
-      <w:r>
-        <w:rPr>
-          <w:rFonts w:ascii="Arial Narrow" w:hAnsi="Arial Narrow"/>
-          <w:sz w:val="20"/>
-          <w:szCs w:val="20"/>
-        </w:rPr>
-        <w:tab/>
-      </w:r>
-      <w:r>
-        <w:rPr>
-          <w:rFonts w:ascii="Arial Narrow" w:hAnsi="Arial Narrow"/>
-          <w:sz w:val="20"/>
-          <w:szCs w:val="20"/>
-        </w:rPr>
-        <w:t>Jun</w:t>
-      </w:r>
-      <w:r>
-        <w:rPr>
-          <w:rFonts w:ascii="Arial Narrow" w:hAnsi="Arial Narrow"/>
-          <w:sz w:val="20"/>
-          <w:szCs w:val="20"/>
-        </w:rPr>
-        <w:t>e</w:t>
-      </w:r>
-      <w:r>
-        <w:rPr>
-          <w:rFonts w:ascii="Arial Narrow" w:hAnsi="Arial Narrow"/>
-          <w:sz w:val="20"/>
-          <w:szCs w:val="20"/>
-        </w:rPr>
-        <w:t xml:space="preserve"> 2023 </w:t>
-      </w:r>
-      <w:r>
-        <w:rPr>
-          <w:rFonts w:ascii="Arial Narrow" w:hAnsi="Arial Narrow"/>
-          <w:sz w:val="20"/>
-          <w:szCs w:val="20"/>
-        </w:rPr>
-        <w:t>–</w:t>
-      </w:r>
-      <w:r>
-        <w:rPr>
-          <w:rFonts w:ascii="Arial Narrow" w:hAnsi="Arial Narrow"/>
-          <w:sz w:val="20"/>
-          <w:szCs w:val="20"/>
-        </w:rPr>
-        <w:t xml:space="preserve"> Aug</w:t>
-      </w:r>
-      <w:r>
-        <w:rPr>
-          <w:rFonts w:ascii="Arial Narrow" w:hAnsi="Arial Narrow"/>
-          <w:sz w:val="20"/>
-          <w:szCs w:val="20"/>
-        </w:rPr>
-        <w:t>ust</w:t>
-      </w:r>
-      <w:r>
-        <w:rPr>
-          <w:rFonts w:ascii="Arial Narrow" w:hAnsi="Arial Narrow"/>
-          <w:sz w:val="20"/>
-          <w:szCs w:val="20"/>
-        </w:rPr>
-        <w:t xml:space="preserve"> 202</w:t>
-      </w:r>
-      <w:r>
-        <w:rPr>
-          <w:rFonts w:ascii="Arial Narrow" w:hAnsi="Arial Narrow"/>
-          <w:sz w:val="20"/>
-          <w:szCs w:val="20"/>
-        </w:rPr>
-        <w:t>3</w:t>
+      </w:pPr>
+      <w:r>
+        <w:rPr>
+          <w:rFonts w:ascii="Arial Narrow" w:hAnsi="Arial Narrow"/>
+          <w:b/>
+          <w:bCs/>
+          <w:sz w:val="20"/>
+          <w:szCs w:val="20"/>
+        </w:rPr>
+        <w:t>RELATED PROJECTS</w:t>
       </w:r>
     </w:p>
     <w:p>
@@ -692,37 +963,36 @@
         <w:tabs>
           <w:tab w:val="right" w:pos="10800"/>
         </w:tabs>
-        <w:spacing w:after="0" w:line="240" w:lineRule="auto"/>
         <w:ind w:left="0" w:firstLine="0"/>
         <w:rPr>
           <w:rFonts w:ascii="Arial Narrow" w:hAnsi="Arial Narrow"/>
-          <w:sz w:val="20"/>
-          <w:szCs w:val="20"/>
-        </w:rPr>
-      </w:pPr>
-      <w:r>
-        <w:rPr>
-          <w:rFonts w:ascii="Arial Narrow" w:hAnsi="Arial Narrow"/>
-          <w:sz w:val="20"/>
-          <w:szCs w:val="20"/>
-        </w:rPr>
-        <w:t>Solis Security</w:t>
-      </w:r>
-      <w:r>
-        <w:rPr>
-          <w:rFonts w:ascii="Arial Narrow" w:hAnsi="Arial Narrow"/>
-          <w:sz w:val="20"/>
-          <w:szCs w:val="20"/>
-        </w:rPr>
-        <w:tab/>
-      </w:r>
-      <w:r>
-        <w:rPr>
-          <w:rFonts w:ascii="Arial Narrow" w:hAnsi="Arial Narrow"/>
-          <w:sz w:val="20"/>
-          <w:szCs w:val="20"/>
-        </w:rPr>
-        <w:t>Austin, TX</w:t>
+          <w:b/>
+          <w:bCs/>
+          <w:sz w:val="20"/>
+          <w:szCs w:val="20"/>
+        </w:rPr>
+      </w:pPr>
+      <w:r>
+        <w:rPr>
+          <w:rFonts w:ascii="Arial Narrow" w:hAnsi="Arial Narrow"/>
+          <w:b/>
+          <w:bCs/>
+          <w:sz w:val="20"/>
+          <w:szCs w:val="20"/>
+        </w:rPr>
+        <w:t>Custom 3D Game Engine </w:t>
+      </w:r>
+      <w:r>
+        <w:rPr>
+          <w:rFonts w:ascii="Arial Narrow" w:hAnsi="Arial Narrow"/>
+          <w:b/>
+          <w:bCs/>
+          <w:i/>
+          <w:iCs/>
+          <w:sz w:val="20"/>
+          <w:szCs w:val="20"/>
+        </w:rPr>
+        <w:t>(C++, DirectX 11)</w:t>
       </w:r>
     </w:p>
     <w:p>
@@ -730,88 +1000,53 @@
         <w:pStyle w:val="ListParagraph"/>
         <w:numPr>
           <w:ilvl w:val="0"/>
-          <w:numId w:val="8"/>
+          <w:numId w:val="18"/>
         </w:numPr>
-        <w:tabs>
-          <w:tab w:val="right" w:pos="10800"/>
-        </w:tabs>
-        <w:spacing w:after="0" w:line="240" w:lineRule="auto"/>
-        <w:rPr>
-          <w:rFonts w:ascii="Arial Narrow" w:hAnsi="Arial Narrow"/>
-          <w:sz w:val="20"/>
-          <w:szCs w:val="20"/>
-        </w:rPr>
-      </w:pPr>
-      <w:r>
-        <w:rPr>
-          <w:rFonts w:ascii="Arial Narrow" w:hAnsi="Arial Narrow"/>
-          <w:sz w:val="20"/>
-          <w:szCs w:val="20"/>
-        </w:rPr>
-        <w:t>Create</w:t>
-      </w:r>
-      <w:r>
-        <w:rPr>
-          <w:rFonts w:ascii="Arial Narrow" w:hAnsi="Arial Narrow"/>
-          <w:sz w:val="20"/>
-          <w:szCs w:val="20"/>
-        </w:rPr>
-        <w:t>d</w:t>
-      </w:r>
-      <w:r>
-        <w:rPr>
-          <w:rFonts w:ascii="Arial Narrow" w:hAnsi="Arial Narrow"/>
-          <w:sz w:val="20"/>
-          <w:szCs w:val="20"/>
-        </w:rPr>
-        <w:t xml:space="preserve"> and manage</w:t>
-      </w:r>
-      <w:r>
-        <w:rPr>
-          <w:rFonts w:ascii="Arial Narrow" w:hAnsi="Arial Narrow"/>
-          <w:sz w:val="20"/>
-          <w:szCs w:val="20"/>
-        </w:rPr>
-        <w:t>d</w:t>
-      </w:r>
-      <w:r>
-        <w:rPr>
-          <w:rFonts w:ascii="Arial Narrow" w:hAnsi="Arial Narrow"/>
-          <w:sz w:val="20"/>
-          <w:szCs w:val="20"/>
-        </w:rPr>
-        <w:t xml:space="preserve"> a Git repository using Microsoft Azure that housed Python scripts that were used </w:t>
-      </w:r>
-    </w:p>
-    <w:p>
-      <w:pPr>
-        <w:pStyle w:val="ListParagraph"/>
-        <w:tabs>
-          <w:tab w:val="right" w:pos="10800"/>
-        </w:tabs>
-        <w:spacing w:after="0" w:line="240" w:lineRule="auto"/>
-        <w:ind w:firstLine="0"/>
-        <w:rPr>
-          <w:rFonts w:ascii="Arial Narrow" w:hAnsi="Arial Narrow"/>
-          <w:sz w:val="20"/>
-          <w:szCs w:val="20"/>
-        </w:rPr>
-      </w:pPr>
-      <w:r>
-        <w:rPr>
-          <w:rFonts w:ascii="Arial Narrow" w:hAnsi="Arial Narrow"/>
-          <w:sz w:val="20"/>
-          <w:szCs w:val="20"/>
-        </w:rPr>
-        <w:t>to display</w:t>
-      </w:r>
-      <w:r>
-        <w:rPr>
-          <w:rFonts w:ascii="Arial Narrow" w:hAnsi="Arial Narrow"/>
-          <w:sz w:val="20"/>
-          <w:szCs w:val="20"/>
-        </w:rPr>
-        <w:t xml:space="preserve"> client security endpoints</w:t>
+        <w:rPr>
+          <w:rFonts w:ascii="Arial Narrow" w:hAnsi="Arial Narrow" w:cs="Arial"/>
+          <w:sz w:val="20"/>
+          <w:szCs w:val="20"/>
+        </w:rPr>
+      </w:pPr>
+      <w:r>
+        <w:rPr>
+          <w:rFonts w:ascii="Arial Narrow" w:hAnsi="Arial Narrow" w:cs="Arial"/>
+          <w:sz w:val="20"/>
+          <w:szCs w:val="20"/>
+        </w:rPr>
+        <w:t>Built a 3D game engine from scratch in C++ with a Direct</w:t>
+      </w:r>
+      <w:r>
+        <w:rPr>
+          <w:rFonts w:ascii="Arial Narrow" w:hAnsi="Arial Narrow" w:cs="Arial"/>
+          <w:sz w:val="20"/>
+          <w:szCs w:val="20"/>
+        </w:rPr>
+        <w:t>X</w:t>
+      </w:r>
+      <w:r>
+        <w:rPr>
+          <w:rFonts w:ascii="Arial Narrow" w:hAnsi="Arial Narrow" w:cs="Arial"/>
+          <w:sz w:val="20"/>
+          <w:szCs w:val="20"/>
+        </w:rPr>
+        <w:t>11 renderer, supporting</w:t>
+      </w:r>
+      <w:r>
+        <w:rPr>
+          <w:rFonts w:ascii="Arial Narrow" w:hAnsi="Arial Narrow" w:cs="Arial"/>
+          <w:sz w:val="20"/>
+          <w:szCs w:val="20"/>
+        </w:rPr>
+        <w:t xml:space="preserve"> </w:t>
+      </w:r>
+      <w:r>
+        <w:rPr>
+          <w:rFonts w:ascii="Arial Narrow" w:hAnsi="Arial Narrow" w:cs="Arial"/>
+          <w:sz w:val="20"/>
+          <w:szCs w:val="20"/>
+        </w:rPr>
+        <w:t>model loading, runtime-compiled HLSL shaders, and switchable orthographic/perspective cameras via normalized viewports</w:t>
       </w:r>
     </w:p>
     <w:p>
@@ -819,41 +1054,39 @@
         <w:pStyle w:val="ListParagraph"/>
         <w:numPr>
           <w:ilvl w:val="0"/>
-          <w:numId w:val="8"/>
+          <w:numId w:val="18"/>
         </w:numPr>
-        <w:tabs>
-          <w:tab w:val="right" w:pos="10800"/>
-        </w:tabs>
-        <w:spacing w:after="0" w:line="240" w:lineRule="auto"/>
-        <w:rPr>
-          <w:rFonts w:ascii="Arial Narrow" w:hAnsi="Arial Narrow"/>
-          <w:sz w:val="20"/>
-          <w:szCs w:val="20"/>
-        </w:rPr>
-      </w:pPr>
-      <w:r>
-        <w:rPr>
-          <w:rFonts w:ascii="Arial Narrow" w:hAnsi="Arial Narrow"/>
-          <w:sz w:val="20"/>
-          <w:szCs w:val="20"/>
-        </w:rPr>
-        <w:t>Perform</w:t>
-      </w:r>
-      <w:r>
-        <w:rPr>
-          <w:rFonts w:ascii="Arial Narrow" w:hAnsi="Arial Narrow"/>
-          <w:sz w:val="20"/>
-          <w:szCs w:val="20"/>
-        </w:rPr>
-        <w:t>ed</w:t>
-      </w:r>
-      <w:r>
-        <w:rPr>
-          <w:rFonts w:ascii="Arial Narrow" w:hAnsi="Arial Narrow"/>
-          <w:sz w:val="20"/>
-          <w:szCs w:val="20"/>
-        </w:rPr>
-        <w:t xml:space="preserve"> daily client security checks using various Enterprise Cybersecurity platforms</w:t>
+        <w:rPr>
+          <w:rFonts w:ascii="Arial Narrow" w:hAnsi="Arial Narrow" w:cs="Arial"/>
+          <w:sz w:val="20"/>
+          <w:szCs w:val="20"/>
+        </w:rPr>
+      </w:pPr>
+      <w:r>
+        <w:rPr>
+          <w:rFonts w:ascii="Arial Narrow" w:hAnsi="Arial Narrow" w:cs="Arial"/>
+          <w:sz w:val="20"/>
+          <w:szCs w:val="20"/>
+        </w:rPr>
+        <w:t>Authored diffuse lighting shaders with directional sunlight, configurable ambient fallback, and TBN (Tangent-Bitangent-Normal) normal mapping using a 60-byte </w:t>
+      </w:r>
+      <w:proofErr w:type="spellStart"/>
+      <w:r>
+        <w:rPr>
+          <w:rFonts w:ascii="Arial Narrow" w:hAnsi="Arial Narrow" w:cs="Arial"/>
+          <w:sz w:val="20"/>
+          <w:szCs w:val="20"/>
+        </w:rPr>
+        <w:t>Vertex_PCUTBN</w:t>
+      </w:r>
+      <w:proofErr w:type="spellEnd"/>
+      <w:r>
+        <w:rPr>
+          <w:rFonts w:ascii="Arial Narrow" w:hAnsi="Arial Narrow" w:cs="Arial"/>
+          <w:sz w:val="20"/>
+          <w:szCs w:val="20"/>
+        </w:rPr>
+        <w:t> format</w:t>
       </w:r>
     </w:p>
     <w:p>
@@ -861,135 +1094,39 @@
         <w:pStyle w:val="ListParagraph"/>
         <w:numPr>
           <w:ilvl w:val="0"/>
-          <w:numId w:val="8"/>
+          <w:numId w:val="18"/>
         </w:numPr>
-        <w:tabs>
-          <w:tab w:val="right" w:pos="10800"/>
-        </w:tabs>
-        <w:spacing w:after="0" w:line="240" w:lineRule="auto"/>
-        <w:rPr>
-          <w:rFonts w:ascii="Arial Narrow" w:hAnsi="Arial Narrow"/>
-          <w:sz w:val="20"/>
-          <w:szCs w:val="20"/>
-        </w:rPr>
-      </w:pPr>
-      <w:r>
-        <w:rPr>
-          <w:rFonts w:ascii="Arial Narrow" w:hAnsi="Arial Narrow"/>
-          <w:sz w:val="20"/>
-          <w:szCs w:val="20"/>
-        </w:rPr>
-        <w:t>Prepare</w:t>
-      </w:r>
-      <w:r>
-        <w:rPr>
-          <w:rFonts w:ascii="Arial Narrow" w:hAnsi="Arial Narrow"/>
-          <w:sz w:val="20"/>
-          <w:szCs w:val="20"/>
-        </w:rPr>
-        <w:t>d</w:t>
-      </w:r>
-      <w:r>
-        <w:rPr>
-          <w:rFonts w:ascii="Arial Narrow" w:hAnsi="Arial Narrow"/>
-          <w:sz w:val="20"/>
-          <w:szCs w:val="20"/>
-        </w:rPr>
-        <w:t xml:space="preserve"> security assessment reports for over 100 clients </w:t>
-      </w:r>
-    </w:p>
-    <w:p>
-      <w:pPr>
-        <w:tabs>
-          <w:tab w:val="right" w:pos="10800"/>
-        </w:tabs>
-        <w:spacing w:after="0" w:line="240" w:lineRule="auto"/>
-        <w:ind w:left="0" w:firstLine="0"/>
-        <w:rPr>
-          <w:rFonts w:ascii="Arial Narrow" w:hAnsi="Arial Narrow"/>
-          <w:sz w:val="20"/>
-          <w:szCs w:val="20"/>
-        </w:rPr>
-      </w:pPr>
-      <w:r>
-        <w:rPr>
-          <w:rFonts w:ascii="Arial Narrow" w:hAnsi="Arial Narrow"/>
-          <w:b/>
-          <w:bCs/>
-          <w:sz w:val="20"/>
-          <w:szCs w:val="20"/>
-        </w:rPr>
-        <w:t>Information Technology Intern</w:t>
-      </w:r>
-      <w:r>
-        <w:rPr>
-          <w:rFonts w:ascii="Arial Narrow" w:hAnsi="Arial Narrow"/>
-          <w:sz w:val="20"/>
-          <w:szCs w:val="20"/>
-        </w:rPr>
-        <w:tab/>
-      </w:r>
-      <w:r>
-        <w:rPr>
-          <w:rFonts w:ascii="Arial Narrow" w:hAnsi="Arial Narrow"/>
-          <w:sz w:val="20"/>
-          <w:szCs w:val="20"/>
-        </w:rPr>
-        <w:t>May 2022 – Aug</w:t>
-      </w:r>
-      <w:r>
-        <w:rPr>
-          <w:rFonts w:ascii="Arial Narrow" w:hAnsi="Arial Narrow"/>
-          <w:sz w:val="20"/>
-          <w:szCs w:val="20"/>
-        </w:rPr>
-        <w:t>ust</w:t>
-      </w:r>
-      <w:r>
-        <w:rPr>
-          <w:rFonts w:ascii="Arial Narrow" w:hAnsi="Arial Narrow"/>
-          <w:sz w:val="20"/>
-          <w:szCs w:val="20"/>
-        </w:rPr>
-        <w:t xml:space="preserve"> 2022</w:t>
-      </w:r>
-    </w:p>
-    <w:p>
-      <w:pPr>
-        <w:tabs>
-          <w:tab w:val="right" w:pos="10800"/>
-        </w:tabs>
-        <w:spacing w:after="0" w:line="240" w:lineRule="auto"/>
-        <w:ind w:left="0" w:firstLine="0"/>
-        <w:rPr>
-          <w:rFonts w:ascii="Arial Narrow" w:hAnsi="Arial Narrow"/>
-          <w:sz w:val="20"/>
-          <w:szCs w:val="20"/>
-        </w:rPr>
-      </w:pPr>
-      <w:r>
-        <w:rPr>
-          <w:rFonts w:ascii="Arial Narrow" w:hAnsi="Arial Narrow"/>
-          <w:sz w:val="20"/>
-          <w:szCs w:val="20"/>
-        </w:rPr>
-        <w:t>Southwestern University</w:t>
-      </w:r>
-      <w:r>
-        <w:rPr>
-          <w:rFonts w:ascii="Arial Narrow" w:hAnsi="Arial Narrow"/>
-          <w:sz w:val="20"/>
-          <w:szCs w:val="20"/>
-        </w:rPr>
-        <w:tab/>
-      </w:r>
-      <w:r>
-        <w:rPr>
-          <w:rFonts w:ascii="Arial Narrow" w:hAnsi="Arial Narrow"/>
-          <w:sz w:val="20"/>
-          <w:szCs w:val="20"/>
-        </w:rPr>
-        <w:t xml:space="preserve">Georgetown, TX </w:t>
+        <w:rPr>
+          <w:rFonts w:ascii="Arial Narrow" w:hAnsi="Arial Narrow" w:cs="Arial"/>
+          <w:sz w:val="20"/>
+          <w:szCs w:val="20"/>
+        </w:rPr>
+      </w:pPr>
+      <w:r>
+        <w:rPr>
+          <w:rFonts w:ascii="Arial Narrow" w:hAnsi="Arial Narrow" w:cs="Arial"/>
+          <w:sz w:val="20"/>
+          <w:szCs w:val="20"/>
+        </w:rPr>
+        <w:t xml:space="preserve">Implemented a configurable pipeline with independent depth testing, alpha/additive blend modes, and rasterizer state control (solid/wireframe, back-face culling), using state </w:t>
+      </w:r>
+      <w:proofErr w:type="gramStart"/>
+      <w:r>
+        <w:rPr>
+          <w:rFonts w:ascii="Arial Narrow" w:hAnsi="Arial Narrow" w:cs="Arial"/>
+          <w:sz w:val="20"/>
+          <w:szCs w:val="20"/>
+        </w:rPr>
+        <w:t>caching</w:t>
+      </w:r>
+      <w:proofErr w:type="gramEnd"/>
+      <w:r>
+        <w:rPr>
+          <w:rFonts w:ascii="Arial Narrow" w:hAnsi="Arial Narrow" w:cs="Arial"/>
+          <w:sz w:val="20"/>
+          <w:szCs w:val="20"/>
+        </w:rPr>
+        <w:t xml:space="preserve"> to minimize redundant GPU calls</w:t>
       </w:r>
     </w:p>
     <w:p>
@@ -997,59 +1134,21 @@
         <w:pStyle w:val="ListParagraph"/>
         <w:numPr>
           <w:ilvl w:val="0"/>
-          <w:numId w:val="9"/>
+          <w:numId w:val="18"/>
         </w:numPr>
-        <w:tabs>
-          <w:tab w:val="right" w:pos="10800"/>
-        </w:tabs>
-        <w:spacing w:after="0" w:line="240" w:lineRule="auto"/>
-        <w:rPr>
-          <w:rFonts w:ascii="Arial Narrow" w:hAnsi="Arial Narrow"/>
-          <w:sz w:val="20"/>
-          <w:szCs w:val="20"/>
-        </w:rPr>
-      </w:pPr>
-      <w:r>
-        <w:rPr>
-          <w:rFonts w:ascii="Arial Narrow" w:hAnsi="Arial Narrow"/>
-          <w:sz w:val="20"/>
-          <w:szCs w:val="20"/>
-        </w:rPr>
-        <w:t>Work</w:t>
-      </w:r>
-      <w:r>
-        <w:rPr>
-          <w:rFonts w:ascii="Arial Narrow" w:hAnsi="Arial Narrow"/>
-          <w:sz w:val="20"/>
-          <w:szCs w:val="20"/>
-        </w:rPr>
-        <w:t>ed</w:t>
-      </w:r>
-      <w:r>
-        <w:rPr>
-          <w:rFonts w:ascii="Arial Narrow" w:hAnsi="Arial Narrow"/>
-          <w:sz w:val="20"/>
-          <w:szCs w:val="20"/>
-        </w:rPr>
-        <w:t xml:space="preserve"> onsite with system admins to </w:t>
-      </w:r>
-      <w:proofErr w:type="gramStart"/>
-      <w:r>
-        <w:rPr>
-          <w:rFonts w:ascii="Arial Narrow" w:hAnsi="Arial Narrow"/>
-          <w:sz w:val="20"/>
-          <w:szCs w:val="20"/>
-        </w:rPr>
-        <w:t>setup</w:t>
-      </w:r>
-      <w:proofErr w:type="gramEnd"/>
-      <w:r>
-        <w:rPr>
-          <w:rFonts w:ascii="Arial Narrow" w:hAnsi="Arial Narrow"/>
-          <w:sz w:val="20"/>
-          <w:szCs w:val="20"/>
-        </w:rPr>
-        <w:t xml:space="preserve"> and maintain existing network infrastructure</w:t>
+        <w:rPr>
+          <w:rFonts w:ascii="Arial Narrow" w:hAnsi="Arial Narrow" w:cs="Arial"/>
+          <w:sz w:val="20"/>
+          <w:szCs w:val="20"/>
+        </w:rPr>
+      </w:pPr>
+      <w:r>
+        <w:rPr>
+          <w:rFonts w:ascii="Arial Narrow" w:hAnsi="Arial Narrow" w:cs="Arial"/>
+          <w:sz w:val="20"/>
+          <w:szCs w:val="20"/>
+        </w:rPr>
+        <w:t>Built a GPU buffer system (vertex, index, constant buffers) with dynamic resizing and a resource cache layer for textures, shaders, and models to eliminate redundant loads across scenes</w:t>
       </w:r>
     </w:p>
     <w:p>
@@ -1057,33 +1156,70 @@
         <w:pStyle w:val="ListParagraph"/>
         <w:numPr>
           <w:ilvl w:val="0"/>
-          <w:numId w:val="9"/>
+          <w:numId w:val="18"/>
         </w:numPr>
-        <w:tabs>
-          <w:tab w:val="right" w:pos="10800"/>
-        </w:tabs>
-        <w:spacing w:after="0" w:line="240" w:lineRule="auto"/>
-        <w:rPr>
-          <w:rFonts w:ascii="Arial Narrow" w:hAnsi="Arial Narrow"/>
-          <w:sz w:val="20"/>
-          <w:szCs w:val="20"/>
-        </w:rPr>
-      </w:pPr>
-      <w:r>
-        <w:rPr>
-          <w:rFonts w:ascii="Arial Narrow" w:hAnsi="Arial Narrow"/>
-          <w:sz w:val="20"/>
-          <w:szCs w:val="20"/>
-        </w:rPr>
-        <w:t>Analyzed diagnostic data to understand causes/correlations of network issues and presented results to internal staff</w:t>
+        <w:rPr>
+          <w:rFonts w:ascii="Arial Narrow" w:hAnsi="Arial Narrow" w:cs="Arial"/>
+          <w:sz w:val="20"/>
+          <w:szCs w:val="20"/>
+        </w:rPr>
+      </w:pPr>
+      <w:r>
+        <w:rPr>
+          <w:rFonts w:ascii="Arial Narrow" w:hAnsi="Arial Narrow" w:cs="Arial"/>
+          <w:sz w:val="20"/>
+          <w:szCs w:val="20"/>
+        </w:rPr>
+        <w:t>Wrote a custom OBJ loader that parses positions, UVs, and normals, deduplicates vertices via hash map, and outputs indexed geometry</w:t>
       </w:r>
     </w:p>
     <w:p>
       <w:pPr>
-        <w:pStyle w:val="ListParagraph"/>
+        <w:tabs>
+          <w:tab w:val="right" w:pos="10800"/>
+        </w:tabs>
+        <w:spacing w:after="0" w:line="240" w:lineRule="auto"/>
+        <w:ind w:left="0" w:firstLine="0"/>
+        <w:rPr>
+          <w:rFonts w:ascii="Arial Narrow" w:hAnsi="Arial Narrow"/>
+          <w:b/>
+          <w:bCs/>
+          <w:i/>
+          <w:iCs/>
+          <w:sz w:val="20"/>
+          <w:szCs w:val="20"/>
+        </w:rPr>
+      </w:pPr>
+      <w:r>
+        <w:rPr>
+          <w:rFonts w:ascii="Arial Narrow" w:hAnsi="Arial Narrow"/>
+          <w:b/>
+          <w:bCs/>
+          <w:i/>
+          <w:iCs/>
+          <w:sz w:val="20"/>
+          <w:szCs w:val="20"/>
+        </w:rPr>
+        <w:t>Hamster Ballin’</w:t>
+      </w:r>
+      <w:r>
+        <w:rPr>
+          <w:rFonts w:ascii="Arial Narrow" w:hAnsi="Arial Narrow"/>
+          <w:b/>
+          <w:bCs/>
+          <w:i/>
+          <w:iCs/>
+          <w:sz w:val="20"/>
+          <w:szCs w:val="20"/>
+        </w:rPr>
+        <w:t xml:space="preserve"> (Unreal)</w:t>
+      </w:r>
+    </w:p>
+    <w:p>
+      <w:pPr>
         <w:numPr>
           <w:ilvl w:val="0"/>
-          <w:numId w:val="9"/>
+          <w:numId w:val="19"/>
         </w:numPr>
         <w:tabs>
           <w:tab w:val="right" w:pos="10800"/>
@@ -1101,354 +1237,7 @@
           <w:sz w:val="20"/>
           <w:szCs w:val="20"/>
         </w:rPr>
-        <w:t xml:space="preserve">Trained junior techs to manage tickets, diagnose common problems, and maintain workflows </w:t>
-      </w:r>
-    </w:p>
-    <w:p>
-      <w:pPr>
-        <w:tabs>
-          <w:tab w:val="right" w:pos="10800"/>
-        </w:tabs>
-        <w:spacing w:after="0" w:line="240" w:lineRule="auto"/>
-        <w:ind w:left="0" w:firstLine="0"/>
-        <w:rPr>
-          <w:rFonts w:ascii="Arial Narrow" w:hAnsi="Arial Narrow"/>
-          <w:sz w:val="20"/>
-          <w:szCs w:val="20"/>
-        </w:rPr>
-      </w:pPr>
-      <w:r>
-        <w:rPr>
-          <w:rFonts w:ascii="Arial Narrow" w:hAnsi="Arial Narrow"/>
-          <w:b/>
-          <w:bCs/>
-          <w:sz w:val="20"/>
-          <w:szCs w:val="20"/>
-        </w:rPr>
-        <w:t xml:space="preserve">Information Technology </w:t>
-      </w:r>
-      <w:r>
-        <w:rPr>
-          <w:rFonts w:ascii="Arial Narrow" w:hAnsi="Arial Narrow"/>
-          <w:b/>
-          <w:bCs/>
-          <w:sz w:val="20"/>
-          <w:szCs w:val="20"/>
-        </w:rPr>
-        <w:t>Support Specialist</w:t>
-      </w:r>
-      <w:r>
-        <w:rPr>
-          <w:rFonts w:ascii="Arial Narrow" w:hAnsi="Arial Narrow"/>
-          <w:sz w:val="20"/>
-          <w:szCs w:val="20"/>
-        </w:rPr>
-        <w:tab/>
-      </w:r>
-      <w:r>
-        <w:rPr>
-          <w:rFonts w:ascii="Arial Narrow" w:hAnsi="Arial Narrow"/>
-          <w:sz w:val="20"/>
-          <w:szCs w:val="20"/>
-        </w:rPr>
-        <w:t>Jul</w:t>
-      </w:r>
-      <w:r>
-        <w:rPr>
-          <w:rFonts w:ascii="Arial Narrow" w:hAnsi="Arial Narrow"/>
-          <w:sz w:val="20"/>
-          <w:szCs w:val="20"/>
-        </w:rPr>
-        <w:t xml:space="preserve"> 202</w:t>
-      </w:r>
-      <w:r>
-        <w:rPr>
-          <w:rFonts w:ascii="Arial Narrow" w:hAnsi="Arial Narrow"/>
-          <w:sz w:val="20"/>
-          <w:szCs w:val="20"/>
-        </w:rPr>
-        <w:t>4</w:t>
-      </w:r>
-      <w:r>
-        <w:rPr>
-          <w:rFonts w:ascii="Arial Narrow" w:hAnsi="Arial Narrow"/>
-          <w:sz w:val="20"/>
-          <w:szCs w:val="20"/>
-        </w:rPr>
-        <w:t xml:space="preserve"> – Aug</w:t>
-      </w:r>
-      <w:r>
-        <w:rPr>
-          <w:rFonts w:ascii="Arial Narrow" w:hAnsi="Arial Narrow"/>
-          <w:sz w:val="20"/>
-          <w:szCs w:val="20"/>
-        </w:rPr>
-        <w:t>ust</w:t>
-      </w:r>
-      <w:r>
-        <w:rPr>
-          <w:rFonts w:ascii="Arial Narrow" w:hAnsi="Arial Narrow"/>
-          <w:sz w:val="20"/>
-          <w:szCs w:val="20"/>
-        </w:rPr>
-        <w:t xml:space="preserve"> 202</w:t>
-      </w:r>
-      <w:r>
-        <w:rPr>
-          <w:rFonts w:ascii="Arial Narrow" w:hAnsi="Arial Narrow"/>
-          <w:sz w:val="20"/>
-          <w:szCs w:val="20"/>
-        </w:rPr>
-        <w:t>5</w:t>
-      </w:r>
-    </w:p>
-    <w:p>
-      <w:pPr>
-        <w:tabs>
-          <w:tab w:val="right" w:pos="10800"/>
-        </w:tabs>
-        <w:spacing w:after="0" w:line="240" w:lineRule="auto"/>
-        <w:ind w:left="0" w:firstLine="0"/>
-        <w:rPr>
-          <w:rFonts w:ascii="Arial Narrow" w:hAnsi="Arial Narrow"/>
-          <w:sz w:val="20"/>
-          <w:szCs w:val="20"/>
-        </w:rPr>
-      </w:pPr>
-      <w:proofErr w:type="spellStart"/>
-      <w:r>
-        <w:rPr>
-          <w:rFonts w:ascii="Arial Narrow" w:hAnsi="Arial Narrow"/>
-          <w:sz w:val="20"/>
-          <w:szCs w:val="20"/>
-        </w:rPr>
-        <w:t>Apptronik</w:t>
-      </w:r>
-      <w:proofErr w:type="spellEnd"/>
-      <w:r>
-        <w:rPr>
-          <w:rFonts w:ascii="Arial Narrow" w:hAnsi="Arial Narrow"/>
-          <w:sz w:val="20"/>
-          <w:szCs w:val="20"/>
-        </w:rPr>
-        <w:tab/>
-        <w:t>Austin</w:t>
-      </w:r>
-      <w:r>
-        <w:rPr>
-          <w:rFonts w:ascii="Arial Narrow" w:hAnsi="Arial Narrow"/>
-          <w:sz w:val="20"/>
-          <w:szCs w:val="20"/>
-        </w:rPr>
-        <w:t xml:space="preserve">, TX </w:t>
-      </w:r>
-    </w:p>
-    <w:p>
-      <w:pPr>
-        <w:pStyle w:val="ListParagraph"/>
-        <w:numPr>
-          <w:ilvl w:val="0"/>
-          <w:numId w:val="9"/>
-        </w:numPr>
-        <w:tabs>
-          <w:tab w:val="right" w:pos="10800"/>
-        </w:tabs>
-        <w:spacing w:after="0" w:line="240" w:lineRule="auto"/>
-        <w:rPr>
-          <w:rFonts w:ascii="Arial Narrow" w:hAnsi="Arial Narrow"/>
-          <w:sz w:val="20"/>
-          <w:szCs w:val="20"/>
-        </w:rPr>
-      </w:pPr>
-      <w:r>
-        <w:rPr>
-          <w:rFonts w:ascii="Arial Narrow" w:hAnsi="Arial Narrow"/>
-          <w:sz w:val="20"/>
-          <w:szCs w:val="20"/>
-        </w:rPr>
-        <w:t>Served as IT support specialist on a 3-person team in a humanoid robotics company, providing day-to-day technical support and helping maintain reliable operations across users and systems.</w:t>
-      </w:r>
-    </w:p>
-    <w:p>
-      <w:pPr>
-        <w:pStyle w:val="ListParagraph"/>
-        <w:numPr>
-          <w:ilvl w:val="0"/>
-          <w:numId w:val="9"/>
-        </w:numPr>
-        <w:tabs>
-          <w:tab w:val="right" w:pos="10800"/>
-        </w:tabs>
-        <w:spacing w:after="0" w:line="240" w:lineRule="auto"/>
-        <w:rPr>
-          <w:rFonts w:ascii="Arial Narrow" w:hAnsi="Arial Narrow"/>
-          <w:sz w:val="20"/>
-          <w:szCs w:val="20"/>
-        </w:rPr>
-      </w:pPr>
-      <w:r>
-        <w:rPr>
-          <w:rFonts w:ascii="Arial Narrow" w:hAnsi="Arial Narrow"/>
-          <w:sz w:val="20"/>
-          <w:szCs w:val="20"/>
-        </w:rPr>
-        <w:t>Acted as the sole Linux support resource, troubleshooting, maintaining, and supporting Linux-based systems critical to engineering and development workflows.</w:t>
-      </w:r>
-      <w:r>
-        <w:t xml:space="preserve"> </w:t>
-      </w:r>
-    </w:p>
-    <w:p>
-      <w:pPr>
-        <w:pStyle w:val="ListParagraph"/>
-        <w:numPr>
-          <w:ilvl w:val="0"/>
-          <w:numId w:val="9"/>
-        </w:numPr>
-        <w:tabs>
-          <w:tab w:val="right" w:pos="10800"/>
-        </w:tabs>
-        <w:spacing w:after="0" w:line="240" w:lineRule="auto"/>
-        <w:rPr>
-          <w:rFonts w:ascii="Arial Narrow" w:hAnsi="Arial Narrow"/>
-          <w:sz w:val="20"/>
-          <w:szCs w:val="20"/>
-        </w:rPr>
-      </w:pPr>
-      <w:r>
-        <w:rPr>
-          <w:rFonts w:ascii="Arial Narrow" w:hAnsi="Arial Narrow"/>
-          <w:sz w:val="20"/>
-          <w:szCs w:val="20"/>
-        </w:rPr>
-        <w:t>Developed and documented provisioning processes for custom embedded machines, improving consistency, setup efficiency, and supportability for specialized robotics hardware.</w:t>
-      </w:r>
-      <w:r>
-        <w:t xml:space="preserve"> </w:t>
-      </w:r>
-    </w:p>
-    <w:p>
-      <w:pPr>
-        <w:pStyle w:val="ListParagraph"/>
-        <w:numPr>
-          <w:ilvl w:val="0"/>
-          <w:numId w:val="9"/>
-        </w:numPr>
-        <w:tabs>
-          <w:tab w:val="right" w:pos="10800"/>
-        </w:tabs>
-        <w:spacing w:after="0" w:line="240" w:lineRule="auto"/>
-        <w:rPr>
-          <w:rFonts w:ascii="Arial Narrow" w:hAnsi="Arial Narrow"/>
-          <w:sz w:val="20"/>
-          <w:szCs w:val="20"/>
-        </w:rPr>
-      </w:pPr>
-      <w:r>
-        <w:rPr>
-          <w:rFonts w:ascii="Arial Narrow" w:hAnsi="Arial Narrow"/>
-          <w:sz w:val="20"/>
-          <w:szCs w:val="20"/>
-        </w:rPr>
-        <w:t xml:space="preserve">Supported overseas operations as a key IT point of contact, helping coordinate technical assistance across time zones and ensuring issues </w:t>
-      </w:r>
-      <w:proofErr w:type="gramStart"/>
-      <w:r>
-        <w:rPr>
-          <w:rFonts w:ascii="Arial Narrow" w:hAnsi="Arial Narrow"/>
-          <w:sz w:val="20"/>
-          <w:szCs w:val="20"/>
-        </w:rPr>
-        <w:t>were</w:t>
-      </w:r>
-      <w:proofErr w:type="gramEnd"/>
-      <w:r>
-        <w:rPr>
-          <w:rFonts w:ascii="Arial Narrow" w:hAnsi="Arial Narrow"/>
-          <w:sz w:val="20"/>
-          <w:szCs w:val="20"/>
-        </w:rPr>
-        <w:t xml:space="preserve"> addressed efficiently for international teams.</w:t>
-      </w:r>
-    </w:p>
-    <w:p>
-      <w:pPr>
-        <w:tabs>
-          <w:tab w:val="right" w:pos="10800"/>
-        </w:tabs>
-        <w:spacing w:after="0" w:line="240" w:lineRule="auto"/>
-        <w:ind w:left="0" w:firstLine="0"/>
-        <w:rPr>
-          <w:rFonts w:ascii="Arial Narrow" w:hAnsi="Arial Narrow"/>
-          <w:sz w:val="20"/>
-          <w:szCs w:val="20"/>
-        </w:rPr>
-      </w:pPr>
-    </w:p>
-    <w:p>
-      <w:pPr>
-        <w:tabs>
-          <w:tab w:val="right" w:pos="10800"/>
-        </w:tabs>
-        <w:spacing w:after="0" w:line="240" w:lineRule="auto"/>
-        <w:ind w:left="0" w:firstLine="0"/>
-        <w:rPr>
-          <w:rFonts w:ascii="Arial Narrow" w:hAnsi="Arial Narrow"/>
-          <w:b/>
-          <w:bCs/>
-          <w:sz w:val="20"/>
-          <w:szCs w:val="20"/>
-        </w:rPr>
-      </w:pPr>
-      <w:r>
-        <w:rPr>
-          <w:rFonts w:ascii="Arial Narrow" w:hAnsi="Arial Narrow"/>
-          <w:b/>
-          <w:bCs/>
-          <w:sz w:val="20"/>
-          <w:szCs w:val="20"/>
-        </w:rPr>
-        <w:t>RELATED PROJECTS</w:t>
-      </w:r>
-    </w:p>
-    <w:p>
-      <w:pPr>
-        <w:tabs>
-          <w:tab w:val="right" w:pos="10800"/>
-        </w:tabs>
-        <w:spacing w:after="0" w:line="240" w:lineRule="auto"/>
-        <w:ind w:left="0" w:firstLine="0"/>
-        <w:rPr>
-          <w:rFonts w:ascii="Arial Narrow" w:hAnsi="Arial Narrow"/>
-          <w:b/>
-          <w:bCs/>
-          <w:sz w:val="20"/>
-          <w:szCs w:val="20"/>
-        </w:rPr>
-      </w:pPr>
-    </w:p>
-    <w:p>
-      <w:pPr>
-        <w:tabs>
-          <w:tab w:val="right" w:pos="10800"/>
-        </w:tabs>
-        <w:spacing w:after="0" w:line="240" w:lineRule="auto"/>
-        <w:ind w:left="0" w:firstLine="0"/>
-        <w:rPr>
-          <w:rFonts w:ascii="Arial Narrow" w:hAnsi="Arial Narrow"/>
-          <w:sz w:val="20"/>
-          <w:szCs w:val="20"/>
-        </w:rPr>
-      </w:pPr>
-      <w:r>
-        <w:rPr>
-          <w:rFonts w:ascii="Arial Narrow" w:hAnsi="Arial Narrow"/>
-          <w:b/>
-          <w:bCs/>
-          <w:sz w:val="20"/>
-          <w:szCs w:val="20"/>
-        </w:rPr>
-        <w:t>Course Scheduling Service (CSS)</w:t>
+        <w:t>Collaborated with a 40+ person team using Scrum methodology to coordinate cross-discipline development across design, art, and engineering</w:t>
       </w:r>
     </w:p>
     <w:p>
@@ -1478,7 +1267,7 @@
           <w:lang w:bidi="ar-SA"/>
           <w14:ligatures w14:val="none"/>
         </w:rPr>
-        <w:t xml:space="preserve">Developed a user-friendly web-based application using JavaScript, Git, Firebase, and </w:t>
+        <w:t xml:space="preserve">Inherited and extended the </w:t>
       </w:r>
       <w:r>
         <w:rPr>
@@ -1490,7 +1279,7 @@
           <w:lang w:bidi="ar-SA"/>
           <w14:ligatures w14:val="none"/>
         </w:rPr>
-        <w:t xml:space="preserve">HTML </w:t>
+        <w:t>prototype</w:t>
       </w:r>
       <w:r>
         <w:rPr>
@@ -1502,19 +1291,7 @@
           <w:lang w:bidi="ar-SA"/>
           <w14:ligatures w14:val="none"/>
         </w:rPr>
-        <w:t>to optimize course schedules for department chairs</w:t>
-      </w:r>
-      <w:r>
-        <w:rPr>
-          <w:rFonts w:ascii="Arial Narrow" w:eastAsia="Times New Roman" w:hAnsi="Arial Narrow" w:cs="Times New Roman"/>
-          <w:color w:val="auto"/>
-          <w:kern w:val="0"/>
-          <w:sz w:val="20"/>
-          <w:szCs w:val="20"/>
-          <w:lang w:bidi="ar-SA"/>
-          <w14:ligatures w14:val="none"/>
-        </w:rPr>
-        <w:t xml:space="preserve"> at Southwestern University</w:t>
+        <w:t xml:space="preserve"> item system for a team-built cart racer, refactoring core mechanics into a maintainable, designer-friendly framework.</w:t>
       </w:r>
     </w:p>
     <w:p>
@@ -1544,7 +1321,7 @@
           <w:lang w:bidi="ar-SA"/>
           <w14:ligatures w14:val="none"/>
         </w:rPr>
-        <w:t>Integrated a Python script leveraging the GLPK library for linear programming techniques</w:t>
+        <w:t xml:space="preserve">Built a track tooling system handling AI behavior, item usage, and racer positioning, exposed through the editor's </w:t>
       </w:r>
       <w:r>
         <w:rPr>
@@ -1556,7 +1333,7 @@
           <w:lang w:bidi="ar-SA"/>
           <w14:ligatures w14:val="none"/>
         </w:rPr>
-        <w:t xml:space="preserve"> which </w:t>
+        <w:t>d</w:t>
       </w:r>
       <w:r>
         <w:rPr>
@@ -1568,109 +1345,142 @@
           <w:lang w:bidi="ar-SA"/>
           <w14:ligatures w14:val="none"/>
         </w:rPr>
-        <w:t xml:space="preserve">effectively </w:t>
-      </w:r>
-      <w:proofErr w:type="gramStart"/>
-      <w:r>
-        <w:rPr>
-          <w:rFonts w:ascii="Arial Narrow" w:eastAsia="Times New Roman" w:hAnsi="Arial Narrow" w:cs="Times New Roman"/>
-          <w:color w:val="auto"/>
-          <w:kern w:val="0"/>
-          <w:sz w:val="20"/>
-          <w:szCs w:val="20"/>
-          <w:lang w:bidi="ar-SA"/>
-          <w14:ligatures w14:val="none"/>
-        </w:rPr>
-        <w:t>manag</w:t>
-      </w:r>
-      <w:r>
-        <w:rPr>
-          <w:rFonts w:ascii="Arial Narrow" w:eastAsia="Times New Roman" w:hAnsi="Arial Narrow" w:cs="Times New Roman"/>
-          <w:color w:val="auto"/>
-          <w:kern w:val="0"/>
-          <w:sz w:val="20"/>
-          <w:szCs w:val="20"/>
-          <w:lang w:bidi="ar-SA"/>
-          <w14:ligatures w14:val="none"/>
-        </w:rPr>
-        <w:t>es</w:t>
-      </w:r>
-      <w:proofErr w:type="gramEnd"/>
-      <w:r>
-        <w:rPr>
-          <w:rFonts w:ascii="Arial Narrow" w:eastAsia="Times New Roman" w:hAnsi="Arial Narrow" w:cs="Times New Roman"/>
-          <w:color w:val="auto"/>
-          <w:kern w:val="0"/>
-          <w:sz w:val="20"/>
-          <w:szCs w:val="20"/>
-          <w:lang w:bidi="ar-SA"/>
-          <w14:ligatures w14:val="none"/>
-        </w:rPr>
-        <w:t xml:space="preserve"> scheduling conflicts</w:t>
+        <w:t>etails panel for rapid in-editor iteration.</w:t>
       </w:r>
     </w:p>
     <w:p>
       <w:pPr>
+        <w:tabs>
+          <w:tab w:val="right" w:pos="10800"/>
+        </w:tabs>
+        <w:spacing w:after="0" w:line="240" w:lineRule="auto"/>
+        <w:ind w:left="0" w:firstLine="0"/>
+        <w:rPr>
+          <w:rFonts w:ascii="Arial Narrow" w:hAnsi="Arial Narrow"/>
+          <w:b/>
+          <w:bCs/>
+          <w:i/>
+          <w:iCs/>
+          <w:sz w:val="20"/>
+          <w:szCs w:val="20"/>
+        </w:rPr>
+      </w:pPr>
+      <w:r>
+        <w:rPr>
+          <w:rFonts w:ascii="Arial Narrow" w:hAnsi="Arial Narrow"/>
+          <w:b/>
+          <w:bCs/>
+          <w:i/>
+          <w:iCs/>
+          <w:sz w:val="20"/>
+          <w:szCs w:val="20"/>
+        </w:rPr>
+        <w:t>Illuminary</w:t>
+      </w:r>
+      <w:r>
+        <w:rPr>
+          <w:rFonts w:ascii="Arial Narrow" w:hAnsi="Arial Narrow"/>
+          <w:b/>
+          <w:bCs/>
+          <w:i/>
+          <w:iCs/>
+          <w:sz w:val="20"/>
+          <w:szCs w:val="20"/>
+        </w:rPr>
+        <w:t xml:space="preserve"> (Unity)</w:t>
+      </w:r>
+    </w:p>
+    <w:p>
+      <w:pPr>
+        <w:pStyle w:val="ListParagraph"/>
         <w:numPr>
           <w:ilvl w:val="0"/>
-          <w:numId w:val="14"/>
+          <w:numId w:val="16"/>
         </w:numPr>
+        <w:tabs>
+          <w:tab w:val="right" w:pos="10800"/>
+        </w:tabs>
         <w:spacing w:after="0" w:line="240" w:lineRule="auto"/>
         <w:rPr>
-          <w:rFonts w:ascii="Arial Narrow" w:eastAsia="Times New Roman" w:hAnsi="Arial Narrow" w:cs="Times New Roman"/>
-          <w:color w:val="auto"/>
-          <w:kern w:val="0"/>
-          <w:sz w:val="20"/>
-          <w:szCs w:val="20"/>
-          <w:lang w:bidi="ar-SA"/>
-          <w14:ligatures w14:val="none"/>
-        </w:rPr>
-      </w:pPr>
-      <w:r>
-        <w:rPr>
-          <w:rFonts w:ascii="Arial Narrow" w:eastAsia="Times New Roman" w:hAnsi="Arial Narrow" w:cs="Times New Roman"/>
-          <w:color w:val="auto"/>
-          <w:kern w:val="0"/>
-          <w:sz w:val="20"/>
-          <w:szCs w:val="20"/>
-          <w:lang w:bidi="ar-SA"/>
-          <w14:ligatures w14:val="none"/>
-        </w:rPr>
-        <w:t xml:space="preserve">Received positive feedback from department chairs </w:t>
+          <w:rFonts w:ascii="Arial Narrow" w:hAnsi="Arial Narrow"/>
+          <w:sz w:val="20"/>
+          <w:szCs w:val="20"/>
+        </w:rPr>
+      </w:pPr>
+      <w:r>
+        <w:rPr>
+          <w:rFonts w:ascii="Arial Narrow" w:hAnsi="Arial Narrow"/>
+          <w:sz w:val="20"/>
+          <w:szCs w:val="20"/>
+        </w:rPr>
+        <w:t xml:space="preserve">Collaborated </w:t>
       </w:r>
       <w:proofErr w:type="gramStart"/>
       <w:r>
         <w:rPr>
-          <w:rFonts w:ascii="Arial Narrow" w:eastAsia="Times New Roman" w:hAnsi="Arial Narrow" w:cs="Times New Roman"/>
-          <w:color w:val="auto"/>
-          <w:kern w:val="0"/>
-          <w:sz w:val="20"/>
-          <w:szCs w:val="20"/>
-          <w:lang w:bidi="ar-SA"/>
-          <w14:ligatures w14:val="none"/>
-        </w:rPr>
-        <w:t>for</w:t>
+          <w:rFonts w:ascii="Arial Narrow" w:hAnsi="Arial Narrow"/>
+          <w:sz w:val="20"/>
+          <w:szCs w:val="20"/>
+        </w:rPr>
+        <w:t>on</w:t>
       </w:r>
       <w:proofErr w:type="gramEnd"/>
       <w:r>
         <w:rPr>
-          <w:rFonts w:ascii="Arial Narrow" w:eastAsia="Times New Roman" w:hAnsi="Arial Narrow" w:cs="Times New Roman"/>
-          <w:color w:val="auto"/>
-          <w:kern w:val="0"/>
-          <w:sz w:val="20"/>
-          <w:szCs w:val="20"/>
-          <w:lang w:bidi="ar-SA"/>
-          <w14:ligatures w14:val="none"/>
-        </w:rPr>
-        <w:t xml:space="preserve"> the application's ease of use and efficiency in scheduling</w:t>
+          <w:rFonts w:ascii="Arial Narrow" w:hAnsi="Arial Narrow"/>
+          <w:sz w:val="20"/>
+          <w:szCs w:val="20"/>
+        </w:rPr>
+        <w:t xml:space="preserve"> a small team of 4 to build a 2D Metroidvania, designing and implementing core systems including modular menu, audio, and movement systems supporting responsive platforming traversal and polished UI flow</w:t>
       </w:r>
     </w:p>
     <w:p>
       <w:pPr>
+        <w:pStyle w:val="ListParagraph"/>
+        <w:numPr>
+          <w:ilvl w:val="0"/>
+          <w:numId w:val="16"/>
+        </w:numPr>
         <w:tabs>
           <w:tab w:val="right" w:pos="10800"/>
         </w:tabs>
         <w:spacing w:after="0" w:line="240" w:lineRule="auto"/>
+        <w:rPr>
+          <w:rFonts w:ascii="Arial Narrow" w:hAnsi="Arial Narrow"/>
+          <w:sz w:val="20"/>
+          <w:szCs w:val="20"/>
+        </w:rPr>
+      </w:pPr>
+      <w:r>
+        <w:rPr>
+          <w:rFonts w:ascii="Arial Narrow" w:hAnsi="Arial Narrow"/>
+          <w:sz w:val="20"/>
+          <w:szCs w:val="20"/>
+        </w:rPr>
+        <w:t>Built an unlock/progression system gating abilities and areas to enable Metroidvania-style exploration and backtracking</w:t>
+      </w:r>
+    </w:p>
+    <w:p>
+      <w:pPr>
+        <w:pStyle w:val="ListParagraph"/>
+        <w:tabs>
+          <w:tab w:val="right" w:pos="10800"/>
+        </w:tabs>
+        <w:spacing w:after="0" w:line="240" w:lineRule="auto"/>
+        <w:ind w:firstLine="0"/>
+        <w:rPr>
+          <w:rFonts w:ascii="Arial Narrow" w:hAnsi="Arial Narrow"/>
+          <w:sz w:val="20"/>
+          <w:szCs w:val="20"/>
+        </w:rPr>
+      </w:pPr>
+    </w:p>
+    <w:p>
+      <w:pPr>
+        <w:tabs>
+          <w:tab w:val="right" w:pos="10800"/>
+        </w:tabs>
+        <w:spacing w:after="0" w:line="360" w:lineRule="auto"/>
         <w:ind w:left="0" w:firstLine="0"/>
         <w:rPr>
           <w:rFonts w:ascii="Arial Narrow" w:hAnsi="Arial Narrow"/>
@@ -1688,185 +1498,8 @@
           <w:sz w:val="20"/>
           <w:szCs w:val="20"/>
         </w:rPr>
-        <w:t>Security Endpoint Scripts</w:t>
-      </w:r>
-    </w:p>
-    <w:p>
-      <w:pPr>
-        <w:numPr>
-          <w:ilvl w:val="0"/>
-          <w:numId w:val="14"/>
-        </w:numPr>
-        <w:spacing w:after="0" w:line="240" w:lineRule="auto"/>
-        <w:rPr>
-          <w:rFonts w:ascii="Arial Narrow" w:eastAsia="Times New Roman" w:hAnsi="Arial Narrow" w:cs="Times New Roman"/>
-          <w:color w:val="auto"/>
-          <w:kern w:val="0"/>
-          <w:sz w:val="20"/>
-          <w:szCs w:val="20"/>
-          <w:lang w:bidi="ar-SA"/>
-          <w14:ligatures w14:val="none"/>
-        </w:rPr>
-      </w:pPr>
-      <w:r>
-        <w:rPr>
-          <w:rFonts w:ascii="Arial Narrow" w:eastAsia="Times New Roman" w:hAnsi="Arial Narrow" w:cs="Times New Roman"/>
-          <w:color w:val="auto"/>
-          <w:kern w:val="0"/>
-          <w:sz w:val="20"/>
-          <w:szCs w:val="20"/>
-          <w:lang w:bidi="ar-SA"/>
-          <w14:ligatures w14:val="none"/>
-        </w:rPr>
-        <w:t xml:space="preserve">Created command line scripts using Python that extracted client security data from varies web services such as </w:t>
-      </w:r>
-      <w:proofErr w:type="spellStart"/>
-      <w:r>
-        <w:rPr>
-          <w:rFonts w:ascii="Arial Narrow" w:eastAsia="Times New Roman" w:hAnsi="Arial Narrow" w:cs="Times New Roman"/>
-          <w:color w:val="auto"/>
-          <w:kern w:val="0"/>
-          <w:sz w:val="20"/>
-          <w:szCs w:val="20"/>
-          <w:lang w:bidi="ar-SA"/>
-          <w14:ligatures w14:val="none"/>
-        </w:rPr>
-        <w:t>Celerium</w:t>
-      </w:r>
-      <w:proofErr w:type="spellEnd"/>
-      <w:r>
-        <w:rPr>
-          <w:rFonts w:ascii="Arial Narrow" w:eastAsia="Times New Roman" w:hAnsi="Arial Narrow" w:cs="Times New Roman"/>
-          <w:color w:val="auto"/>
-          <w:kern w:val="0"/>
-          <w:sz w:val="20"/>
-          <w:szCs w:val="20"/>
-          <w:lang w:bidi="ar-SA"/>
-          <w14:ligatures w14:val="none"/>
-        </w:rPr>
-        <w:t xml:space="preserve"> and </w:t>
-      </w:r>
-      <w:proofErr w:type="spellStart"/>
-      <w:r>
-        <w:rPr>
-          <w:rFonts w:ascii="Arial Narrow" w:eastAsia="Times New Roman" w:hAnsi="Arial Narrow" w:cs="Times New Roman"/>
-          <w:color w:val="auto"/>
-          <w:kern w:val="0"/>
-          <w:sz w:val="20"/>
-          <w:szCs w:val="20"/>
-          <w:lang w:bidi="ar-SA"/>
-          <w14:ligatures w14:val="none"/>
-        </w:rPr>
-        <w:t>SentinelOne</w:t>
-      </w:r>
-      <w:proofErr w:type="spellEnd"/>
-    </w:p>
-    <w:p>
-      <w:pPr>
-        <w:numPr>
-          <w:ilvl w:val="0"/>
-          <w:numId w:val="14"/>
-        </w:numPr>
-        <w:spacing w:after="0" w:line="240" w:lineRule="auto"/>
-        <w:rPr>
-          <w:rFonts w:ascii="Arial Narrow" w:eastAsia="Times New Roman" w:hAnsi="Arial Narrow" w:cs="Times New Roman"/>
-          <w:color w:val="auto"/>
-          <w:kern w:val="0"/>
-          <w:sz w:val="20"/>
-          <w:szCs w:val="20"/>
-          <w:lang w:bidi="ar-SA"/>
-          <w14:ligatures w14:val="none"/>
-        </w:rPr>
-      </w:pPr>
-      <w:r>
-        <w:rPr>
-          <w:rFonts w:ascii="Arial Narrow" w:hAnsi="Arial Narrow"/>
-          <w:sz w:val="20"/>
-          <w:szCs w:val="20"/>
-        </w:rPr>
-        <w:t xml:space="preserve">Implemented </w:t>
-      </w:r>
-      <w:r>
-        <w:rPr>
-          <w:rFonts w:ascii="Arial Narrow" w:hAnsi="Arial Narrow"/>
-          <w:sz w:val="20"/>
-          <w:szCs w:val="20"/>
-        </w:rPr>
-        <w:t xml:space="preserve">various </w:t>
-      </w:r>
-      <w:r>
-        <w:rPr>
-          <w:rFonts w:ascii="Arial Narrow" w:hAnsi="Arial Narrow"/>
-          <w:sz w:val="20"/>
-          <w:szCs w:val="20"/>
-        </w:rPr>
-        <w:t>algorithms to efficiently process and present data, enhancing data accessibility and usability for clients</w:t>
-      </w:r>
-      <w:r>
-        <w:rPr>
-          <w:rFonts w:ascii="Arial Narrow" w:hAnsi="Arial Narrow"/>
-          <w:sz w:val="20"/>
-          <w:szCs w:val="20"/>
-        </w:rPr>
-        <w:tab/>
-      </w:r>
-    </w:p>
-    <w:p>
-      <w:pPr>
-        <w:pStyle w:val="ListParagraph"/>
-        <w:tabs>
-          <w:tab w:val="right" w:pos="10800"/>
-        </w:tabs>
-        <w:spacing w:after="0" w:line="240" w:lineRule="auto"/>
-        <w:ind w:firstLine="0"/>
-        <w:rPr>
-          <w:rFonts w:ascii="Arial Narrow" w:hAnsi="Arial Narrow"/>
-          <w:sz w:val="20"/>
-          <w:szCs w:val="20"/>
-        </w:rPr>
-      </w:pPr>
-    </w:p>
-    <w:p>
-      <w:pPr>
-        <w:tabs>
-          <w:tab w:val="right" w:pos="10800"/>
-        </w:tabs>
-        <w:spacing w:after="0" w:line="240" w:lineRule="auto"/>
-        <w:ind w:left="0" w:firstLine="0"/>
-        <w:rPr>
-          <w:rFonts w:ascii="Arial Narrow" w:hAnsi="Arial Narrow"/>
-          <w:b/>
-          <w:bCs/>
-          <w:sz w:val="20"/>
-          <w:szCs w:val="20"/>
-        </w:rPr>
-      </w:pPr>
-      <w:r>
-        <w:rPr>
-          <w:rFonts w:ascii="Arial Narrow" w:hAnsi="Arial Narrow"/>
-          <w:b/>
-          <w:bCs/>
-          <w:sz w:val="20"/>
-          <w:szCs w:val="20"/>
-        </w:rPr>
         <w:t>SKILLS</w:t>
       </w:r>
-    </w:p>
-    <w:p>
-      <w:pPr>
-        <w:tabs>
-          <w:tab w:val="right" w:pos="10800"/>
-        </w:tabs>
-        <w:spacing w:after="0" w:line="240" w:lineRule="auto"/>
-        <w:ind w:left="0" w:firstLine="0"/>
-        <w:rPr>
-          <w:rFonts w:ascii="Arial Narrow" w:hAnsi="Arial Narrow"/>
-          <w:b/>
-          <w:bCs/>
-          <w:sz w:val="20"/>
-          <w:szCs w:val="20"/>
-        </w:rPr>
-      </w:pPr>
     </w:p>
     <w:p>
       <w:pPr>
@@ -2095,6 +1728,119 @@
 <file path=word/numbering.xml><?xml version="1.0" encoding="utf-8"?>
 <w:numbering xmlns:wpc="http://schemas.microsoft.com/office/word/2010/wordprocessingCanvas" xmlns:cx="http://schemas.microsoft.com/office/drawing/2014/chartex" xmlns:cx1="http://schemas.microsoft.com/office/drawing/2015/9/8/chartex" xmlns:cx2="http://schemas.microsoft.com/office/drawing/2015/10/21/chartex" xmlns:cx3="http://schemas.microsoft.com/office/drawing/2016/5/9/chartex" xmlns:cx4="http://schemas.microsoft.com/office/drawing/2016/5/10/chartex" xmlns:cx5="http://schemas.microsoft.com/office/drawing/2016/5/11/chartex" xmlns:cx6="http://schemas.microsoft.com/office/drawing/2016/5/12/chartex" xmlns:cx7="http://schemas.microsoft.com/office/drawing/2016/5/13/chartex" xmlns:cx8="http://schemas.microsoft.com/office/drawing/2016/5/14/chartex" xmlns:mc="http://schemas.openxmlformats.org/markup-compatibility/2006" xmlns:aink="http://schemas.microsoft.com/office/drawing/2016/ink" xmlns:am3d="http://schemas.microsoft.com/office/drawing/2017/model3d" xmlns:o="urn:schemas-microsoft-com:office:office" xmlns:oel="http://schemas.microsoft.com/office/2019/extlst" xmlns:r="http://schemas.openxmlformats.org/officeDocument/2006/relationships" xmlns:m="http://schemas.openxmlformats.org/officeDocument/2006/math" xmlns:v="urn:schemas-microsoft-com:vml" xmlns:wp14="http://schemas.microsoft.com/office/word/2010/wordprocessingDrawing" xmlns:wp="http://schemas.openxmlformats.org/drawingml/2006/wordprocessingDrawing" xmlns:w10="urn:schemas-microsoft-com:office:word" xmlns:w="http://schemas.openxmlformats.org/wordprocessingml/2006/main" xmlns:w14="http://schemas.microsoft.com/office/word/2010/wordml" xmlns:w15="http://schemas.microsoft.com/office/word/2012/wordml" xmlns:w16cex="http://schemas.microsoft.com/office/word/2018/wordml/cex" xmlns:w16cid="http://schemas.microsoft.com/office/word/2016/wordml/cid" xmlns:w16="http://schemas.microsoft.com/office/word/2018/wordml" xmlns:w16du="http://schemas.microsoft.com/office/word/2023/wordml/word16du" xmlns:w16sdtdh="http://schemas.microsoft.com/office/word/2020/wordml/sdtdatahash" xmlns:w16sdtfl="http://schemas.microsoft.com/office/word/2024/wordml/sdtformatlock" xmlns:w16se="http://schemas.microsoft.com/office/word/2015/wordml/symex" xmlns:wpg="http://schemas.microsoft.com/office/word/2010/wordprocessingGroup" xmlns:wpi="http://schemas.microsoft.com/office/word/2010/wordprocessingInk" xmlns:wne="http://schemas.microsoft.com/office/word/2006/wordml" xmlns:wps="http://schemas.microsoft.com/office/word/2010/wordprocessingShape" mc:Ignorable="w14 w15 w16se w16cid w16 w16cex w16sdtdh w16sdtfl w16du wp14">
   <w:abstractNum w:abstractNumId="0" w15:restartNumberingAfterBreak="0">
+    <w:nsid w:val="0A674DD0"/>
+    <w:multiLevelType w:val="hybridMultilevel"/>
+    <w:tmpl w:val="EF982F60"/>
+    <w:lvl w:ilvl="0" w:tplc="04090001">
+      <w:start w:val="1"/>
+      <w:numFmt w:val="bullet"/>
+      <w:lvlText w:val=""/>
+      <w:lvlJc w:val="left"/>
+      <w:pPr>
+        <w:ind w:left="720" w:hanging="360"/>
+      </w:pPr>
+      <w:rPr>
+        <w:rFonts w:ascii="Symbol" w:hAnsi="Symbol" w:hint="default"/>
+      </w:rPr>
+    </w:lvl>
+    <w:lvl w:ilvl="1" w:tplc="04090003" w:tentative="1">
+      <w:start w:val="1"/>
+      <w:numFmt w:val="bullet"/>
+      <w:lvlText w:val="o"/>
+      <w:lvlJc w:val="left"/>
+      <w:pPr>
+        <w:ind w:left="1440" w:hanging="360"/>
+      </w:pPr>
+      <w:rPr>
+        <w:rFonts w:ascii="Courier New" w:hAnsi="Courier New" w:cs="Courier New" w:hint="default"/>
+      </w:rPr>
+    </w:lvl>
+    <w:lvl w:ilvl="2" w:tplc="04090005" w:tentative="1">
+      <w:start w:val="1"/>
+      <w:numFmt w:val="bullet"/>
+      <w:lvlText w:val=""/>
+      <w:lvlJc w:val="left"/>
+      <w:pPr>
+        <w:ind w:left="2160" w:hanging="360"/>
+      </w:pPr>
+      <w:rPr>
+        <w:rFonts w:ascii="Wingdings" w:hAnsi="Wingdings" w:hint="default"/>
+      </w:rPr>
+    </w:lvl>
+    <w:lvl w:ilvl="3" w:tplc="04090001" w:tentative="1">
+      <w:start w:val="1"/>
+      <w:numFmt w:val="bullet"/>
+      <w:lvlText w:val=""/>
+      <w:lvlJc w:val="left"/>
+      <w:pPr>
+        <w:ind w:left="2880" w:hanging="360"/>
+      </w:pPr>
+      <w:rPr>
+        <w:rFonts w:ascii="Symbol" w:hAnsi="Symbol" w:hint="default"/>
+      </w:rPr>
+    </w:lvl>
+    <w:lvl w:ilvl="4" w:tplc="04090003" w:tentative="1">
+      <w:start w:val="1"/>
+      <w:numFmt w:val="bullet"/>
+      <w:lvlText w:val="o"/>
+      <w:lvlJc w:val="left"/>
+      <w:pPr>
+        <w:ind w:left="3600" w:hanging="360"/>
+      </w:pPr>
+      <w:rPr>
+        <w:rFonts w:ascii="Courier New" w:hAnsi="Courier New" w:cs="Courier New" w:hint="default"/>
+      </w:rPr>
+    </w:lvl>
+    <w:lvl w:ilvl="5" w:tplc="04090005" w:tentative="1">
+      <w:start w:val="1"/>
+      <w:numFmt w:val="bullet"/>
+      <w:lvlText w:val=""/>
+      <w:lvlJc w:val="left"/>
+      <w:pPr>
+        <w:ind w:left="4320" w:hanging="360"/>
+      </w:pPr>
+      <w:rPr>
+        <w:rFonts w:ascii="Wingdings" w:hAnsi="Wingdings" w:hint="default"/>
+      </w:rPr>
+    </w:lvl>
+    <w:lvl w:ilvl="6" w:tplc="04090001" w:tentative="1">
+      <w:start w:val="1"/>
+      <w:numFmt w:val="bullet"/>
+      <w:lvlText w:val=""/>
+      <w:lvlJc w:val="left"/>
+      <w:pPr>
+        <w:ind w:left="5040" w:hanging="360"/>
+      </w:pPr>
+      <w:rPr>
+        <w:rFonts w:ascii="Symbol" w:hAnsi="Symbol" w:hint="default"/>
+      </w:rPr>
+    </w:lvl>
+    <w:lvl w:ilvl="7" w:tplc="04090003" w:tentative="1">
+      <w:start w:val="1"/>
+      <w:numFmt w:val="bullet"/>
+      <w:lvlText w:val="o"/>
+      <w:lvlJc w:val="left"/>
+      <w:pPr>
+        <w:ind w:left="5760" w:hanging="360"/>
+      </w:pPr>
+      <w:rPr>
+        <w:rFonts w:ascii="Courier New" w:hAnsi="Courier New" w:cs="Courier New" w:hint="default"/>
+      </w:rPr>
+    </w:lvl>
+    <w:lvl w:ilvl="8" w:tplc="04090005" w:tentative="1">
+      <w:start w:val="1"/>
+      <w:numFmt w:val="bullet"/>
+      <w:lvlText w:val=""/>
+      <w:lvlJc w:val="left"/>
+      <w:pPr>
+        <w:ind w:left="6480" w:hanging="360"/>
+      </w:pPr>
+      <w:rPr>
+        <w:rFonts w:ascii="Wingdings" w:hAnsi="Wingdings" w:hint="default"/>
+      </w:rPr>
+    </w:lvl>
+  </w:abstractNum>
+  <w:abstractNum w:abstractNumId="1" w15:restartNumberingAfterBreak="0">
     <w:nsid w:val="0CE02C31"/>
     <w:multiLevelType w:val="hybridMultilevel"/>
     <w:tmpl w:val="FD728F78"/>
@@ -2207,7 +1953,7 @@
       </w:rPr>
     </w:lvl>
   </w:abstractNum>
-  <w:abstractNum w:abstractNumId="1" w15:restartNumberingAfterBreak="0">
+  <w:abstractNum w:abstractNumId="2" w15:restartNumberingAfterBreak="0">
     <w:nsid w:val="11D37800"/>
     <w:multiLevelType w:val="hybridMultilevel"/>
     <w:tmpl w:val="B67AD3D8"/>
@@ -2419,7 +2165,156 @@
       </w:rPr>
     </w:lvl>
   </w:abstractNum>
-  <w:abstractNum w:abstractNumId="2" w15:restartNumberingAfterBreak="0">
+  <w:abstractNum w:abstractNumId="3" w15:restartNumberingAfterBreak="0">
+    <w:nsid w:val="1E363CFE"/>
+    <w:multiLevelType w:val="multilevel"/>
+    <w:tmpl w:val="5E2AE68C"/>
+    <w:lvl w:ilvl="0">
+      <w:start w:val="1"/>
+      <w:numFmt w:val="bullet"/>
+      <w:lvlText w:val=""/>
+      <w:lvlJc w:val="left"/>
+      <w:pPr>
+        <w:tabs>
+          <w:tab w:val="num" w:pos="720"/>
+        </w:tabs>
+        <w:ind w:left="720" w:hanging="360"/>
+      </w:pPr>
+      <w:rPr>
+        <w:rFonts w:ascii="Symbol" w:hAnsi="Symbol" w:hint="default"/>
+        <w:sz w:val="20"/>
+      </w:rPr>
+    </w:lvl>
+    <w:lvl w:ilvl="1" w:tentative="1">
+      <w:start w:val="1"/>
+      <w:numFmt w:val="bullet"/>
+      <w:lvlText w:val="o"/>
+      <w:lvlJc w:val="left"/>
+      <w:pPr>
+        <w:tabs>
+          <w:tab w:val="num" w:pos="1440"/>
+        </w:tabs>
+        <w:ind w:left="1440" w:hanging="360"/>
+      </w:pPr>
+      <w:rPr>
+        <w:rFonts w:ascii="Courier New" w:hAnsi="Courier New" w:hint="default"/>
+        <w:sz w:val="20"/>
+      </w:rPr>
+    </w:lvl>
+    <w:lvl w:ilvl="2" w:tentative="1">
+      <w:start w:val="1"/>
+      <w:numFmt w:val="bullet"/>
+      <w:lvlText w:val=""/>
+      <w:lvlJc w:val="left"/>
+      <w:pPr>
+        <w:tabs>
+          <w:tab w:val="num" w:pos="2160"/>
+        </w:tabs>
+        <w:ind w:left="2160" w:hanging="360"/>
+      </w:pPr>
+      <w:rPr>
+        <w:rFonts w:ascii="Wingdings" w:hAnsi="Wingdings" w:hint="default"/>
+        <w:sz w:val="20"/>
+      </w:rPr>
+    </w:lvl>
+    <w:lvl w:ilvl="3" w:tentative="1">
+      <w:start w:val="1"/>
+      <w:numFmt w:val="bullet"/>
+      <w:lvlText w:val=""/>
+      <w:lvlJc w:val="left"/>
+      <w:pPr>
+        <w:tabs>
+          <w:tab w:val="num" w:pos="2880"/>
+        </w:tabs>
+        <w:ind w:left="2880" w:hanging="360"/>
+      </w:pPr>
+      <w:rPr>
+        <w:rFonts w:ascii="Wingdings" w:hAnsi="Wingdings" w:hint="default"/>
+        <w:sz w:val="20"/>
+      </w:rPr>
+    </w:lvl>
+    <w:lvl w:ilvl="4" w:tentative="1">
+      <w:start w:val="1"/>
+      <w:numFmt w:val="bullet"/>
+      <w:lvlText w:val=""/>
+      <w:lvlJc w:val="left"/>
+      <w:pPr>
+        <w:tabs>
+          <w:tab w:val="num" w:pos="3600"/>
+        </w:tabs>
+        <w:ind w:left="3600" w:hanging="360"/>
+      </w:pPr>
+      <w:rPr>
+        <w:rFonts w:ascii="Wingdings" w:hAnsi="Wingdings" w:hint="default"/>
+        <w:sz w:val="20"/>
+      </w:rPr>
+    </w:lvl>
+    <w:lvl w:ilvl="5" w:tentative="1">
+      <w:start w:val="1"/>
+      <w:numFmt w:val="bullet"/>
+      <w:lvlText w:val=""/>
+      <w:lvlJc w:val="left"/>
+      <w:pPr>
+        <w:tabs>
+          <w:tab w:val="num" w:pos="4320"/>
+        </w:tabs>
+        <w:ind w:left="4320" w:hanging="360"/>
+      </w:pPr>
+      <w:rPr>
+        <w:rFonts w:ascii="Wingdings" w:hAnsi="Wingdings" w:hint="default"/>
+        <w:sz w:val="20"/>
+      </w:rPr>
+    </w:lvl>
+    <w:lvl w:ilvl="6" w:tentative="1">
+      <w:start w:val="1"/>
+      <w:numFmt w:val="bullet"/>
+      <w:lvlText w:val=""/>
+      <w:lvlJc w:val="left"/>
+      <w:pPr>
+        <w:tabs>
+          <w:tab w:val="num" w:pos="5040"/>
+        </w:tabs>
+        <w:ind w:left="5040" w:hanging="360"/>
+      </w:pPr>
+      <w:rPr>
+        <w:rFonts w:ascii="Wingdings" w:hAnsi="Wingdings" w:hint="default"/>
+        <w:sz w:val="20"/>
+      </w:rPr>
+    </w:lvl>
+    <w:lvl w:ilvl="7" w:tentative="1">
+      <w:start w:val="1"/>
+      <w:numFmt w:val="bullet"/>
+      <w:lvlText w:val=""/>
+      <w:lvlJc w:val="left"/>
+      <w:pPr>
+        <w:tabs>
+          <w:tab w:val="num" w:pos="5760"/>
+        </w:tabs>
+        <w:ind w:left="5760" w:hanging="360"/>
+      </w:pPr>
+      <w:rPr>
+        <w:rFonts w:ascii="Wingdings" w:hAnsi="Wingdings" w:hint="default"/>
+        <w:sz w:val="20"/>
+      </w:rPr>
+    </w:lvl>
+    <w:lvl w:ilvl="8" w:tentative="1">
+      <w:start w:val="1"/>
+      <w:numFmt w:val="bullet"/>
+      <w:lvlText w:val=""/>
+      <w:lvlJc w:val="left"/>
+      <w:pPr>
+        <w:tabs>
+          <w:tab w:val="num" w:pos="6480"/>
+        </w:tabs>
+        <w:ind w:left="6480" w:hanging="360"/>
+      </w:pPr>
+      <w:rPr>
+        <w:rFonts w:ascii="Wingdings" w:hAnsi="Wingdings" w:hint="default"/>
+        <w:sz w:val="20"/>
+      </w:rPr>
+    </w:lvl>
+  </w:abstractNum>
+  <w:abstractNum w:abstractNumId="4" w15:restartNumberingAfterBreak="0">
     <w:nsid w:val="23CA33EF"/>
     <w:multiLevelType w:val="hybridMultilevel"/>
     <w:tmpl w:val="37E8144A"/>
@@ -2532,7 +2427,7 @@
       </w:rPr>
     </w:lvl>
   </w:abstractNum>
-  <w:abstractNum w:abstractNumId="3" w15:restartNumberingAfterBreak="0">
+  <w:abstractNum w:abstractNumId="5" w15:restartNumberingAfterBreak="0">
     <w:nsid w:val="27581DBD"/>
     <w:multiLevelType w:val="hybridMultilevel"/>
     <w:tmpl w:val="3C40B980"/>
@@ -2744,7 +2639,7 @@
       </w:rPr>
     </w:lvl>
   </w:abstractNum>
-  <w:abstractNum w:abstractNumId="4" w15:restartNumberingAfterBreak="0">
+  <w:abstractNum w:abstractNumId="6" w15:restartNumberingAfterBreak="0">
     <w:nsid w:val="29A13E4A"/>
     <w:multiLevelType w:val="hybridMultilevel"/>
     <w:tmpl w:val="EFAC5546"/>
@@ -2857,7 +2752,156 @@
       </w:rPr>
     </w:lvl>
   </w:abstractNum>
-  <w:abstractNum w:abstractNumId="5" w15:restartNumberingAfterBreak="0">
+  <w:abstractNum w:abstractNumId="7" w15:restartNumberingAfterBreak="0">
+    <w:nsid w:val="2B2858EA"/>
+    <w:multiLevelType w:val="multilevel"/>
+    <w:tmpl w:val="9D1A5F10"/>
+    <w:lvl w:ilvl="0">
+      <w:start w:val="1"/>
+      <w:numFmt w:val="bullet"/>
+      <w:lvlText w:val=""/>
+      <w:lvlJc w:val="left"/>
+      <w:pPr>
+        <w:tabs>
+          <w:tab w:val="num" w:pos="720"/>
+        </w:tabs>
+        <w:ind w:left="720" w:hanging="360"/>
+      </w:pPr>
+      <w:rPr>
+        <w:rFonts w:ascii="Symbol" w:hAnsi="Symbol" w:hint="default"/>
+        <w:sz w:val="20"/>
+      </w:rPr>
+    </w:lvl>
+    <w:lvl w:ilvl="1" w:tentative="1">
+      <w:start w:val="1"/>
+      <w:numFmt w:val="bullet"/>
+      <w:lvlText w:val="o"/>
+      <w:lvlJc w:val="left"/>
+      <w:pPr>
+        <w:tabs>
+          <w:tab w:val="num" w:pos="1440"/>
+        </w:tabs>
+        <w:ind w:left="1440" w:hanging="360"/>
+      </w:pPr>
+      <w:rPr>
+        <w:rFonts w:ascii="Courier New" w:hAnsi="Courier New" w:hint="default"/>
+        <w:sz w:val="20"/>
+      </w:rPr>
+    </w:lvl>
+    <w:lvl w:ilvl="2" w:tentative="1">
+      <w:start w:val="1"/>
+      <w:numFmt w:val="bullet"/>
+      <w:lvlText w:val=""/>
+      <w:lvlJc w:val="left"/>
+      <w:pPr>
+        <w:tabs>
+          <w:tab w:val="num" w:pos="2160"/>
+        </w:tabs>
+        <w:ind w:left="2160" w:hanging="360"/>
+      </w:pPr>
+      <w:rPr>
+        <w:rFonts w:ascii="Wingdings" w:hAnsi="Wingdings" w:hint="default"/>
+        <w:sz w:val="20"/>
+      </w:rPr>
+    </w:lvl>
+    <w:lvl w:ilvl="3" w:tentative="1">
+      <w:start w:val="1"/>
+      <w:numFmt w:val="bullet"/>
+      <w:lvlText w:val=""/>
+      <w:lvlJc w:val="left"/>
+      <w:pPr>
+        <w:tabs>
+          <w:tab w:val="num" w:pos="2880"/>
+        </w:tabs>
+        <w:ind w:left="2880" w:hanging="360"/>
+      </w:pPr>
+      <w:rPr>
+        <w:rFonts w:ascii="Wingdings" w:hAnsi="Wingdings" w:hint="default"/>
+        <w:sz w:val="20"/>
+      </w:rPr>
+    </w:lvl>
+    <w:lvl w:ilvl="4" w:tentative="1">
+      <w:start w:val="1"/>
+      <w:numFmt w:val="bullet"/>
+      <w:lvlText w:val=""/>
+      <w:lvlJc w:val="left"/>
+      <w:pPr>
+        <w:tabs>
+          <w:tab w:val="num" w:pos="3600"/>
+        </w:tabs>
+        <w:ind w:left="3600" w:hanging="360"/>
+      </w:pPr>
+      <w:rPr>
+        <w:rFonts w:ascii="Wingdings" w:hAnsi="Wingdings" w:hint="default"/>
+        <w:sz w:val="20"/>
+      </w:rPr>
+    </w:lvl>
+    <w:lvl w:ilvl="5" w:tentative="1">
+      <w:start w:val="1"/>
+      <w:numFmt w:val="bullet"/>
+      <w:lvlText w:val=""/>
+      <w:lvlJc w:val="left"/>
+      <w:pPr>
+        <w:tabs>
+          <w:tab w:val="num" w:pos="4320"/>
+        </w:tabs>
+        <w:ind w:left="4320" w:hanging="360"/>
+      </w:pPr>
+      <w:rPr>
+        <w:rFonts w:ascii="Wingdings" w:hAnsi="Wingdings" w:hint="default"/>
+        <w:sz w:val="20"/>
+      </w:rPr>
+    </w:lvl>
+    <w:lvl w:ilvl="6" w:tentative="1">
+      <w:start w:val="1"/>
+      <w:numFmt w:val="bullet"/>
+      <w:lvlText w:val=""/>
+      <w:lvlJc w:val="left"/>
+      <w:pPr>
+        <w:tabs>
+          <w:tab w:val="num" w:pos="5040"/>
+        </w:tabs>
+        <w:ind w:left="5040" w:hanging="360"/>
+      </w:pPr>
+      <w:rPr>
+        <w:rFonts w:ascii="Wingdings" w:hAnsi="Wingdings" w:hint="default"/>
+        <w:sz w:val="20"/>
+      </w:rPr>
+    </w:lvl>
+    <w:lvl w:ilvl="7" w:tentative="1">
+      <w:start w:val="1"/>
+      <w:numFmt w:val="bullet"/>
+      <w:lvlText w:val=""/>
+      <w:lvlJc w:val="left"/>
+      <w:pPr>
+        <w:tabs>
+          <w:tab w:val="num" w:pos="5760"/>
+        </w:tabs>
+        <w:ind w:left="5760" w:hanging="360"/>
+      </w:pPr>
+      <w:rPr>
+        <w:rFonts w:ascii="Wingdings" w:hAnsi="Wingdings" w:hint="default"/>
+        <w:sz w:val="20"/>
+      </w:rPr>
+    </w:lvl>
+    <w:lvl w:ilvl="8" w:tentative="1">
+      <w:start w:val="1"/>
+      <w:numFmt w:val="bullet"/>
+      <w:lvlText w:val=""/>
+      <w:lvlJc w:val="left"/>
+      <w:pPr>
+        <w:tabs>
+          <w:tab w:val="num" w:pos="6480"/>
+        </w:tabs>
+        <w:ind w:left="6480" w:hanging="360"/>
+      </w:pPr>
+      <w:rPr>
+        <w:rFonts w:ascii="Wingdings" w:hAnsi="Wingdings" w:hint="default"/>
+        <w:sz w:val="20"/>
+      </w:rPr>
+    </w:lvl>
+  </w:abstractNum>
+  <w:abstractNum w:abstractNumId="8" w15:restartNumberingAfterBreak="0">
     <w:nsid w:val="31A306A0"/>
     <w:multiLevelType w:val="hybridMultilevel"/>
     <w:tmpl w:val="A3767E40"/>
@@ -2970,7 +3014,7 @@
       </w:rPr>
     </w:lvl>
   </w:abstractNum>
-  <w:abstractNum w:abstractNumId="6" w15:restartNumberingAfterBreak="0">
+  <w:abstractNum w:abstractNumId="9" w15:restartNumberingAfterBreak="0">
     <w:nsid w:val="37197F81"/>
     <w:multiLevelType w:val="hybridMultilevel"/>
     <w:tmpl w:val="7EDA1986"/>
@@ -3182,7 +3226,7 @@
       </w:rPr>
     </w:lvl>
   </w:abstractNum>
-  <w:abstractNum w:abstractNumId="7" w15:restartNumberingAfterBreak="0">
+  <w:abstractNum w:abstractNumId="10" w15:restartNumberingAfterBreak="0">
     <w:nsid w:val="37323BE2"/>
     <w:multiLevelType w:val="hybridMultilevel"/>
     <w:tmpl w:val="FB802606"/>
@@ -3394,7 +3438,7 @@
       </w:rPr>
     </w:lvl>
   </w:abstractNum>
-  <w:abstractNum w:abstractNumId="8" w15:restartNumberingAfterBreak="0">
+  <w:abstractNum w:abstractNumId="11" w15:restartNumberingAfterBreak="0">
     <w:nsid w:val="3E946D44"/>
     <w:multiLevelType w:val="hybridMultilevel"/>
     <w:tmpl w:val="56C683E0"/>
@@ -3606,7 +3650,7 @@
       </w:rPr>
     </w:lvl>
   </w:abstractNum>
-  <w:abstractNum w:abstractNumId="9" w15:restartNumberingAfterBreak="0">
+  <w:abstractNum w:abstractNumId="12" w15:restartNumberingAfterBreak="0">
     <w:nsid w:val="4A70622F"/>
     <w:multiLevelType w:val="hybridMultilevel"/>
     <w:tmpl w:val="07A83A60"/>
@@ -3719,7 +3763,120 @@
       </w:rPr>
     </w:lvl>
   </w:abstractNum>
-  <w:abstractNum w:abstractNumId="10" w15:restartNumberingAfterBreak="0">
+  <w:abstractNum w:abstractNumId="13" w15:restartNumberingAfterBreak="0">
+    <w:nsid w:val="4C9D6A02"/>
+    <w:multiLevelType w:val="hybridMultilevel"/>
+    <w:tmpl w:val="25AA2E3E"/>
+    <w:lvl w:ilvl="0" w:tplc="04090001">
+      <w:start w:val="1"/>
+      <w:numFmt w:val="bullet"/>
+      <w:lvlText w:val=""/>
+      <w:lvlJc w:val="left"/>
+      <w:pPr>
+        <w:ind w:left="720" w:hanging="360"/>
+      </w:pPr>
+      <w:rPr>
+        <w:rFonts w:ascii="Symbol" w:hAnsi="Symbol" w:hint="default"/>
+      </w:rPr>
+    </w:lvl>
+    <w:lvl w:ilvl="1" w:tplc="04090003" w:tentative="1">
+      <w:start w:val="1"/>
+      <w:numFmt w:val="bullet"/>
+      <w:lvlText w:val="o"/>
+      <w:lvlJc w:val="left"/>
+      <w:pPr>
+        <w:ind w:left="1440" w:hanging="360"/>
+      </w:pPr>
+      <w:rPr>
+        <w:rFonts w:ascii="Courier New" w:hAnsi="Courier New" w:cs="Courier New" w:hint="default"/>
+      </w:rPr>
+    </w:lvl>
+    <w:lvl w:ilvl="2" w:tplc="04090005" w:tentative="1">
+      <w:start w:val="1"/>
+      <w:numFmt w:val="bullet"/>
+      <w:lvlText w:val=""/>
+      <w:lvlJc w:val="left"/>
+      <w:pPr>
+        <w:ind w:left="2160" w:hanging="360"/>
+      </w:pPr>
+      <w:rPr>
+        <w:rFonts w:ascii="Wingdings" w:hAnsi="Wingdings" w:hint="default"/>
+      </w:rPr>
+    </w:lvl>
+    <w:lvl w:ilvl="3" w:tplc="04090001" w:tentative="1">
+      <w:start w:val="1"/>
+      <w:numFmt w:val="bullet"/>
+      <w:lvlText w:val=""/>
+      <w:lvlJc w:val="left"/>
+      <w:pPr>
+        <w:ind w:left="2880" w:hanging="360"/>
+      </w:pPr>
+      <w:rPr>
+        <w:rFonts w:ascii="Symbol" w:hAnsi="Symbol" w:hint="default"/>
+      </w:rPr>
+    </w:lvl>
+    <w:lvl w:ilvl="4" w:tplc="04090003" w:tentative="1">
+      <w:start w:val="1"/>
+      <w:numFmt w:val="bullet"/>
+      <w:lvlText w:val="o"/>
+      <w:lvlJc w:val="left"/>
+      <w:pPr>
+        <w:ind w:left="3600" w:hanging="360"/>
+      </w:pPr>
+      <w:rPr>
+        <w:rFonts w:ascii="Courier New" w:hAnsi="Courier New" w:cs="Courier New" w:hint="default"/>
+      </w:rPr>
+    </w:lvl>
+    <w:lvl w:ilvl="5" w:tplc="04090005" w:tentative="1">
+      <w:start w:val="1"/>
+      <w:numFmt w:val="bullet"/>
+      <w:lvlText w:val=""/>
+      <w:lvlJc w:val="left"/>
+      <w:pPr>
+        <w:ind w:left="4320" w:hanging="360"/>
+      </w:pPr>
+      <w:rPr>
+        <w:rFonts w:ascii="Wingdings" w:hAnsi="Wingdings" w:hint="default"/>
+      </w:rPr>
+    </w:lvl>
+    <w:lvl w:ilvl="6" w:tplc="04090001" w:tentative="1">
+      <w:start w:val="1"/>
+      <w:numFmt w:val="bullet"/>
+      <w:lvlText w:val=""/>
+      <w:lvlJc w:val="left"/>
+      <w:pPr>
+        <w:ind w:left="5040" w:hanging="360"/>
+      </w:pPr>
+      <w:rPr>
+        <w:rFonts w:ascii="Symbol" w:hAnsi="Symbol" w:hint="default"/>
+      </w:rPr>
+    </w:lvl>
+    <w:lvl w:ilvl="7" w:tplc="04090003" w:tentative="1">
+      <w:start w:val="1"/>
+      <w:numFmt w:val="bullet"/>
+      <w:lvlText w:val="o"/>
+      <w:lvlJc w:val="left"/>
+      <w:pPr>
+        <w:ind w:left="5760" w:hanging="360"/>
+      </w:pPr>
+      <w:rPr>
+        <w:rFonts w:ascii="Courier New" w:hAnsi="Courier New" w:cs="Courier New" w:hint="default"/>
+      </w:rPr>
+    </w:lvl>
+    <w:lvl w:ilvl="8" w:tplc="04090005" w:tentative="1">
+      <w:start w:val="1"/>
+      <w:numFmt w:val="bullet"/>
+      <w:lvlText w:val=""/>
+      <w:lvlJc w:val="left"/>
+      <w:pPr>
+        <w:ind w:left="6480" w:hanging="360"/>
+      </w:pPr>
+      <w:rPr>
+        <w:rFonts w:ascii="Wingdings" w:hAnsi="Wingdings" w:hint="default"/>
+      </w:rPr>
+    </w:lvl>
+  </w:abstractNum>
+  <w:abstractNum w:abstractNumId="14" w15:restartNumberingAfterBreak="0">
     <w:nsid w:val="57A647E9"/>
     <w:multiLevelType w:val="hybridMultilevel"/>
     <w:tmpl w:val="09F6816C"/>
@@ -3931,7 +4088,7 @@
       </w:rPr>
     </w:lvl>
   </w:abstractNum>
-  <w:abstractNum w:abstractNumId="11" w15:restartNumberingAfterBreak="0">
+  <w:abstractNum w:abstractNumId="15" w15:restartNumberingAfterBreak="0">
     <w:nsid w:val="59985884"/>
     <w:multiLevelType w:val="hybridMultilevel"/>
     <w:tmpl w:val="F49CA4E6"/>
@@ -4044,7 +4201,7 @@
       </w:rPr>
     </w:lvl>
   </w:abstractNum>
-  <w:abstractNum w:abstractNumId="12" w15:restartNumberingAfterBreak="0">
+  <w:abstractNum w:abstractNumId="16" w15:restartNumberingAfterBreak="0">
     <w:nsid w:val="6D8961DF"/>
     <w:multiLevelType w:val="hybridMultilevel"/>
     <w:tmpl w:val="09880B6A"/>
@@ -4157,7 +4314,7 @@
       </w:rPr>
     </w:lvl>
   </w:abstractNum>
-  <w:abstractNum w:abstractNumId="13" w15:restartNumberingAfterBreak="0">
+  <w:abstractNum w:abstractNumId="17" w15:restartNumberingAfterBreak="0">
     <w:nsid w:val="7A074338"/>
     <w:multiLevelType w:val="multilevel"/>
     <w:tmpl w:val="FDC4E668"/>
@@ -4307,46 +4464,61 @@
     </w:lvl>
   </w:abstractNum>
   <w:num w:numId="1" w16cid:durableId="98767004">
+    <w:abstractNumId w:val="10"/>
+  </w:num>
+  <w:num w:numId="2" w16cid:durableId="248387836">
+    <w:abstractNumId w:val="14"/>
+  </w:num>
+  <w:num w:numId="3" w16cid:durableId="631785571">
+    <w:abstractNumId w:val="2"/>
+  </w:num>
+  <w:num w:numId="4" w16cid:durableId="867987027">
+    <w:abstractNumId w:val="5"/>
+  </w:num>
+  <w:num w:numId="5" w16cid:durableId="1976904492">
+    <w:abstractNumId w:val="9"/>
+  </w:num>
+  <w:num w:numId="6" w16cid:durableId="132145116">
+    <w:abstractNumId w:val="11"/>
+  </w:num>
+  <w:num w:numId="7" w16cid:durableId="536937326">
+    <w:abstractNumId w:val="12"/>
+  </w:num>
+  <w:num w:numId="8" w16cid:durableId="1034766079">
+    <w:abstractNumId w:val="15"/>
+  </w:num>
+  <w:num w:numId="9" w16cid:durableId="134031322">
+    <w:abstractNumId w:val="1"/>
+  </w:num>
+  <w:num w:numId="10" w16cid:durableId="520358581">
+    <w:abstractNumId w:val="16"/>
+  </w:num>
+  <w:num w:numId="11" w16cid:durableId="197399070">
+    <w:abstractNumId w:val="8"/>
+  </w:num>
+  <w:num w:numId="12" w16cid:durableId="1514876814">
+    <w:abstractNumId w:val="4"/>
+  </w:num>
+  <w:num w:numId="13" w16cid:durableId="547646271">
+    <w:abstractNumId w:val="6"/>
+  </w:num>
+  <w:num w:numId="14" w16cid:durableId="1609579970">
+    <w:abstractNumId w:val="17"/>
+  </w:num>
+  <w:num w:numId="15" w16cid:durableId="349726025">
+    <w:abstractNumId w:val="4"/>
+  </w:num>
+  <w:num w:numId="16" w16cid:durableId="28460014">
+    <w:abstractNumId w:val="13"/>
+  </w:num>
+  <w:num w:numId="17" w16cid:durableId="1011876211">
     <w:abstractNumId w:val="7"/>
   </w:num>
-  <w:num w:numId="2" w16cid:durableId="248387836">
-    <w:abstractNumId w:val="10"/>
-  </w:num>
-  <w:num w:numId="3" w16cid:durableId="631785571">
-    <w:abstractNumId w:val="1"/>
-  </w:num>
-  <w:num w:numId="4" w16cid:durableId="867987027">
-    <w:abstractNumId w:val="3"/>
-  </w:num>
-  <w:num w:numId="5" w16cid:durableId="1976904492">
-    <w:abstractNumId w:val="6"/>
-  </w:num>
-  <w:num w:numId="6" w16cid:durableId="132145116">
-    <w:abstractNumId w:val="8"/>
-  </w:num>
-  <w:num w:numId="7" w16cid:durableId="536937326">
-    <w:abstractNumId w:val="9"/>
-  </w:num>
-  <w:num w:numId="8" w16cid:durableId="1034766079">
-    <w:abstractNumId w:val="11"/>
-  </w:num>
-  <w:num w:numId="9" w16cid:durableId="134031322">
+  <w:num w:numId="18" w16cid:durableId="691540459">
     <w:abstractNumId w:val="0"/>
   </w:num>
-  <w:num w:numId="10" w16cid:durableId="520358581">
-    <w:abstractNumId w:val="12"/>
-  </w:num>
-  <w:num w:numId="11" w16cid:durableId="197399070">
-    <w:abstractNumId w:val="5"/>
-  </w:num>
-  <w:num w:numId="12" w16cid:durableId="1514876814">
-    <w:abstractNumId w:val="2"/>
-  </w:num>
-  <w:num w:numId="13" w16cid:durableId="547646271">
-    <w:abstractNumId w:val="4"/>
-  </w:num>
-  <w:num w:numId="14" w16cid:durableId="1609579970">
-    <w:abstractNumId w:val="13"/>
+  <w:num w:numId="19" w16cid:durableId="554387981">
+    <w:abstractNumId w:val="3"/>
   </w:num>
 </w:numbering>
 </file>
@@ -4826,7 +4998,6 @@
   <w:style w:type="character" w:default="1" w:styleId="DefaultParagraphFont">
     <w:name w:val="Default Paragraph Font"/>
     <w:uiPriority w:val="1"/>
-    <w:semiHidden/>
     <w:unhideWhenUsed/>
   </w:style>
   <w:style w:type="table" w:default="1" w:styleId="TableNormal">

</xml_diff>